<commit_message>
BD II: guion por lamina en las notas, ideas escritas, pasos logicos e ilustraciones en todas las clases; SQL verificado en PGlite
Co-Authored-By: Claude Opus 5.5 <noreply@anthropic.com>
</commit_message>
<xml_diff>
--- a/Bases de Datos II/Kit docente/Clase 1/Guion Docente Clase 1 - Revision BD I y modelo de datos.docx
+++ b/Bases de Datos II/Kit docente/Clase 1/Guion Docente Clase 1 - Revision BD I y modelo de datos.docx
@@ -9,7 +9,7 @@
           <w:color w:val="1A1C1D"/>
           <w:sz w:val="44"/>
         </w:rPr>
-        <w:t>Guion docente · Clase 1 · Revision BD I · Arranque VetCare DB</w:t>
+        <w:t>Guion docente · Clase 1 · Revision BD I · Arranque de la base de datos</w:t>
       </w:r>
     </w:p>
     <w:p>
@@ -290,17 +290,17 @@
           <w:color w:val="1A1C1D"/>
           <w:sz w:val="32"/>
         </w:rPr>
-        <w:t>Apoyo por diapositiva</w:t>
-      </w:r>
-    </w:p>
-    <w:p>
-      <w:r>
-        <w:rPr>
-          <w:b w:val="0"/>
-          <w:color w:val="4A4A49"/>
-          <w:sz w:val="22"/>
-        </w:rPr>
-        <w:t xml:space="preserve">Todo lo que hay que decir </w:t>
+        <w:t>Guion por diapositiva</w:t>
+      </w:r>
+    </w:p>
+    <w:p>
+      <w:r>
+        <w:rPr>
+          <w:b w:val="0"/>
+          <w:color w:val="4A4A49"/>
+          <w:sz w:val="22"/>
+        </w:rPr>
+        <w:t xml:space="preserve">Es el mismo texto que llevan las </w:t>
       </w:r>
       <w:r>
         <w:rPr>
@@ -308,2151 +308,15 @@
           <w:color w:val="4A4A49"/>
           <w:sz w:val="22"/>
         </w:rPr>
-        <w:t>esta proyectado</w:t>
-      </w:r>
-      <w:r>
-        <w:rPr>
-          <w:b w:val="0"/>
-          <w:color w:val="4A4A49"/>
-          <w:sz w:val="22"/>
-        </w:rPr>
-        <w:t>. Esta seccion dice que subrayar en cada lamina, no repite su contenido.</w:t>
-      </w:r>
-    </w:p>
-    <w:p>
-      <w:r>
-        <w:rPr>
-          <w:b/>
-          <w:color w:val="4A4A49"/>
-          <w:sz w:val="22"/>
-        </w:rPr>
-        <w:t>[Slide 5] Por que esto no es Bases de Datos I, y el vocabulario minimo</w:t>
-      </w:r>
-      <w:r>
-        <w:rPr>
-          <w:b w:val="0"/>
-          <w:color w:val="4A4A49"/>
-          <w:sz w:val="22"/>
-        </w:rPr>
-        <w:t xml:space="preserve"> — 4 vinetas.</w:t>
-      </w:r>
-    </w:p>
-    <w:p>
-      <w:pPr>
-        <w:pStyle w:val="ListBullet2"/>
-      </w:pPr>
-      <w:r>
-        <w:rPr>
-          <w:b w:val="0"/>
-          <w:color w:val="4A4A49"/>
-          <w:sz w:val="22"/>
-        </w:rPr>
-        <w:t>DESARROLLO (para explicarlo, no se proyecta):</w:t>
-      </w:r>
-    </w:p>
-    <w:p>
-      <w:pPr>
-        <w:pStyle w:val="ListBullet2"/>
-      </w:pPr>
-      <w:r>
-        <w:rPr>
-          <w:b w:val="0"/>
-          <w:color w:val="4A4A49"/>
-          <w:sz w:val="22"/>
-        </w:rPr>
-        <w:t>Alla el objetivo era escribir consultas que devolvieran el resultado correcto</w:t>
-      </w:r>
-    </w:p>
-    <w:p>
-      <w:pPr>
-        <w:pStyle w:val="ListBullet2"/>
-      </w:pPr>
-      <w:r>
-        <w:rPr>
-          <w:b w:val="0"/>
-          <w:color w:val="4A4A49"/>
-          <w:sz w:val="22"/>
-        </w:rPr>
-        <w:t>Aqui es disenar un esquema que siga siendo correcto cuando lo usen tres personas distintas, cuando tenga cien mil filas y cuando alguien meta datos malos, a veces por error y a veces a proposito.</w:t>
-      </w:r>
-    </w:p>
-    <w:p>
-      <w:pPr>
-        <w:pStyle w:val="ListBullet2"/>
-      </w:pPr>
-      <w:r>
-        <w:rPr>
-          <w:b w:val="0"/>
-          <w:color w:val="4A4A49"/>
-          <w:sz w:val="22"/>
-        </w:rPr>
-        <w:t>Una tabla, o relacion, es un conjunto de entidades del mismo tipo: mascota guarda mascotas y nada mas.</w:t>
-      </w:r>
-    </w:p>
-    <w:p>
-      <w:pPr>
-        <w:pStyle w:val="ListBullet2"/>
-      </w:pPr>
-      <w:r>
-        <w:rPr>
-          <w:b w:val="0"/>
-          <w:color w:val="4A4A49"/>
-          <w:sz w:val="22"/>
-        </w:rPr>
-        <w:t>Una fila es una instancia concreta e irrepetible: la perra Luna de la duena Ana Perez.</w:t>
-      </w:r>
-    </w:p>
-    <w:p>
-      <w:pPr>
-        <w:pStyle w:val="ListBullet2"/>
-      </w:pPr>
-      <w:r>
-        <w:rPr>
-          <w:b w:val="0"/>
-          <w:color w:val="4A4A49"/>
-          <w:sz w:val="22"/>
-        </w:rPr>
-        <w:t>Una columna es un atributo, y todo atributo tiene un dominio, el conjunto de valores que el motor considera legales: especie no acepta cualquier texto, acepta Canino, Felino, Ave u Otro.</w:t>
-      </w:r>
-    </w:p>
-    <w:p>
-      <w:pPr>
-        <w:pStyle w:val="ListBullet2"/>
-      </w:pPr>
-      <w:r>
-        <w:rPr>
-          <w:b w:val="0"/>
-          <w:color w:val="4A4A49"/>
-          <w:sz w:val="22"/>
-        </w:rPr>
-        <w:t>Sobre estas tres nociones se monta el semestre: los roles de la Clase 2 se otorgan sobre tablas, los procedimientos de la Clase 3 validan columnas y los indices de la Clase 7 se crean sobre columnas concretas.</w:t>
-      </w:r>
-    </w:p>
-    <w:p>
-      <w:pPr>
-        <w:pStyle w:val="ListBullet2"/>
-      </w:pPr>
-      <w:r>
-        <w:rPr>
-          <w:b w:val="0"/>
-          <w:color w:val="4A4A49"/>
-          <w:sz w:val="22"/>
-        </w:rPr>
-        <w:t>NOTAS:</w:t>
-      </w:r>
-    </w:p>
-    <w:p>
-      <w:pPr>
-        <w:pStyle w:val="ListBullet2"/>
-      </w:pPr>
-      <w:r>
-        <w:rPr>
-          <w:b w:val="0"/>
-          <w:color w:val="4A4A49"/>
-          <w:sz w:val="22"/>
-        </w:rPr>
-        <w:t>Esta clase parece repetir Bases de Datos I y no lo hace.</w:t>
-      </w:r>
-    </w:p>
-    <w:p>
-      <w:pPr>
-        <w:pStyle w:val="ListBullet2"/>
-      </w:pPr>
-      <w:r>
-        <w:rPr>
-          <w:b w:val="0"/>
-          <w:color w:val="4A4A49"/>
-          <w:sz w:val="22"/>
-        </w:rPr>
-        <w:t>Conviene fijar el vocabulario operativo antes de dibujar nada.</w:t>
-      </w:r>
-    </w:p>
-    <w:p>
-      <w:pPr>
-        <w:pStyle w:val="ListBullet2"/>
-      </w:pPr>
-      <w:r>
-        <w:rPr>
-          <w:b w:val="0"/>
-          <w:color w:val="4A4A49"/>
-          <w:sz w:val="22"/>
-        </w:rPr>
-        <w:t>Conviene desactivar una trampa de vocabulario: la palabra dominio se usara hoy con dos sentidos, el de un atributo y el del proyecto, que es la clínica.</w:t>
-      </w:r>
-    </w:p>
-    <w:p>
-      <w:r>
-        <w:rPr>
-          <w:b/>
-          <w:color w:val="4A4A49"/>
-          <w:sz w:val="22"/>
-        </w:rPr>
-        <w:t>[Slide 6] Nivel conceptual y nivel fisico: dos vistas del mismo modelo</w:t>
-      </w:r>
-      <w:r>
-        <w:rPr>
-          <w:b w:val="0"/>
-          <w:color w:val="4A4A49"/>
-          <w:sz w:val="22"/>
-        </w:rPr>
-        <w:t xml:space="preserve"> — 3 vinetas.</w:t>
-      </w:r>
-    </w:p>
-    <w:p>
-      <w:pPr>
-        <w:pStyle w:val="ListBullet2"/>
-      </w:pPr>
-      <w:r>
-        <w:rPr>
-          <w:b w:val="0"/>
-          <w:color w:val="4A4A49"/>
-          <w:sz w:val="22"/>
-        </w:rPr>
-        <w:t>DESARROLLO (para explicarlo, no se proyecta):</w:t>
-      </w:r>
-    </w:p>
-    <w:p>
-      <w:pPr>
-        <w:pStyle w:val="ListBullet2"/>
-      </w:pPr>
-      <w:r>
-        <w:rPr>
-          <w:b w:val="0"/>
-          <w:color w:val="4A4A49"/>
-          <w:sz w:val="22"/>
-        </w:rPr>
-        <w:t>El nivel conceptual nombra entidades y relaciones con vocabulario de negocio y sin comprometerse con ningun motor: Dueno posee Mascota, Veterinario atiende Cita.</w:t>
-      </w:r>
-    </w:p>
-    <w:p>
-      <w:pPr>
-        <w:pStyle w:val="ListBullet2"/>
-      </w:pPr>
-      <w:r>
-        <w:rPr>
-          <w:b w:val="0"/>
-          <w:color w:val="4A4A49"/>
-          <w:sz w:val="22"/>
-        </w:rPr>
-        <w:t>El nivel fisico convierte esas entidades en tablas con columnas tipadas, longitudes, restricciones y claves: dueno.telefono VARCHAR(30) NOT NULL.</w:t>
-      </w:r>
-    </w:p>
-    <w:p>
-      <w:pPr>
-        <w:pStyle w:val="ListBullet2"/>
-      </w:pPr>
-      <w:r>
-        <w:rPr>
-          <w:b w:val="0"/>
-          <w:color w:val="4A4A49"/>
-          <w:sz w:val="22"/>
-        </w:rPr>
-        <w:t>Son dos vistas del MISMO modelo, no dos modelos distintos, y esa es la razon de que la clase produzca dos artefactos: el diagrama ER es la vista conceptual, y el guion CREATE TABLE es la misma informacion en fisico.</w:t>
-      </w:r>
-    </w:p>
-    <w:p>
-      <w:pPr>
-        <w:pStyle w:val="ListBullet2"/>
-      </w:pPr>
-      <w:r>
-        <w:rPr>
-          <w:b w:val="0"/>
-          <w:color w:val="4A4A49"/>
-          <w:sz w:val="22"/>
-        </w:rPr>
-        <w:t>El criterio operativo para saber si el conceptual esta completo es exactamente ese: si otra persona puede escribir el fisico mirandolo, sin preguntar nada, esta completo.</w:t>
-      </w:r>
-    </w:p>
-    <w:p>
-      <w:pPr>
-        <w:pStyle w:val="ListBullet2"/>
-      </w:pPr>
-      <w:r>
-        <w:rPr>
-          <w:b w:val="0"/>
-          <w:color w:val="4A4A49"/>
-          <w:sz w:val="22"/>
-        </w:rPr>
-        <w:t>NOTAS:</w:t>
-      </w:r>
-    </w:p>
-    <w:p>
-      <w:pPr>
-        <w:pStyle w:val="ListBullet2"/>
-      </w:pPr>
-      <w:r>
-        <w:rPr>
-          <w:b w:val="0"/>
-          <w:color w:val="4A4A49"/>
-          <w:sz w:val="22"/>
-        </w:rPr>
-        <w:t>Antes de cualquier otra cosa hay que separar dos niveles que el estudiante mezcla y que hoy se recorren los dos.</w:t>
-      </w:r>
-    </w:p>
-    <w:p>
-      <w:pPr>
-        <w:pStyle w:val="ListBullet2"/>
-      </w:pPr>
-      <w:r>
-        <w:rPr>
-          <w:b w:val="0"/>
-          <w:color w:val="4A4A49"/>
-          <w:sz w:val="22"/>
-        </w:rPr>
-        <w:t>Conviene decirlo en voz alta porque explica por que se exige tipo y longitud en el diagrama: no es decoracion, es lo que hace traducible el dibujo.</w:t>
-      </w:r>
-    </w:p>
-    <w:p>
-      <w:r>
-        <w:rPr>
-          <w:b/>
-          <w:color w:val="4A4A49"/>
-          <w:sz w:val="22"/>
-        </w:rPr>
-        <w:t>[Slide 7] ER minimo VetCare (con cardinalidad)</w:t>
-      </w:r>
-      <w:r>
-        <w:rPr>
-          <w:b w:val="0"/>
-          <w:color w:val="4A4A49"/>
-          <w:sz w:val="22"/>
-        </w:rPr>
-        <w:t xml:space="preserve"> — 6 vinetas.</w:t>
-      </w:r>
-    </w:p>
-    <w:p>
-      <w:r>
-        <w:rPr>
-          <w:b/>
-          <w:color w:val="4A4A49"/>
-          <w:sz w:val="22"/>
-        </w:rPr>
-        <w:t>[Slide 8] El DDL minimo que sostiene el ER</w:t>
-      </w:r>
-      <w:r>
-        <w:rPr>
-          <w:b w:val="0"/>
-          <w:color w:val="4A4A49"/>
-          <w:sz w:val="22"/>
-        </w:rPr>
-        <w:t xml:space="preserve"> — 9 vinetas.</w:t>
-      </w:r>
-    </w:p>
-    <w:p>
-      <w:r>
-        <w:rPr>
-          <w:b/>
-          <w:color w:val="4A4A49"/>
-          <w:sz w:val="22"/>
-        </w:rPr>
-        <w:t>[Slide 9] El patron de tabla: PK, obligatorios y dominio cerrado</w:t>
-      </w:r>
-      <w:r>
-        <w:rPr>
-          <w:b w:val="0"/>
-          <w:color w:val="4A4A49"/>
-          <w:sz w:val="22"/>
-        </w:rPr>
-        <w:t xml:space="preserve"> — 10 vinetas.</w:t>
-      </w:r>
-    </w:p>
-    <w:p>
-      <w:r>
-        <w:rPr>
-          <w:b/>
-          <w:color w:val="4A4A49"/>
-          <w:sz w:val="22"/>
-        </w:rPr>
-        <w:t>[Slide 10] El JOIN de tres tablas</w:t>
-      </w:r>
-      <w:r>
-        <w:rPr>
-          <w:b w:val="0"/>
-          <w:color w:val="4A4A49"/>
-          <w:sz w:val="22"/>
-        </w:rPr>
-        <w:t xml:space="preserve"> — 10 vinetas.</w:t>
-      </w:r>
-    </w:p>
-    <w:p>
-      <w:r>
-        <w:rPr>
-          <w:b/>
-          <w:color w:val="4A4A49"/>
-          <w:sz w:val="22"/>
-        </w:rPr>
-        <w:t>[Slide 11] Clave primaria: natural o sustituta</w:t>
-      </w:r>
-      <w:r>
-        <w:rPr>
-          <w:b w:val="0"/>
-          <w:color w:val="4A4A49"/>
-          <w:sz w:val="22"/>
-        </w:rPr>
-        <w:t xml:space="preserve"> — 4 vinetas.</w:t>
-      </w:r>
-    </w:p>
-    <w:p>
-      <w:pPr>
-        <w:pStyle w:val="ListBullet2"/>
-      </w:pPr>
-      <w:r>
-        <w:rPr>
-          <w:b w:val="0"/>
-          <w:color w:val="4A4A49"/>
-          <w:sz w:val="22"/>
-        </w:rPr>
-        <w:t>DESARROLLO (para explicarlo, no se proyecta):</w:t>
-      </w:r>
-    </w:p>
-    <w:p>
-      <w:pPr>
-        <w:pStyle w:val="ListBullet2"/>
-      </w:pPr>
-      <w:r>
-        <w:rPr>
-          <w:b w:val="0"/>
-          <w:color w:val="4A4A49"/>
-          <w:sz w:val="22"/>
-        </w:rPr>
-        <w:t>La clave primaria es la columna, o el conjunto de columnas, que identifica una fila sin ambiguedad: no se repite y no admite nulos.</w:t>
-      </w:r>
-    </w:p>
-    <w:p>
-      <w:pPr>
-        <w:pStyle w:val="ListBullet2"/>
-      </w:pPr>
-      <w:r>
-        <w:rPr>
-          <w:b w:val="0"/>
-          <w:color w:val="4A4A49"/>
-          <w:sz w:val="22"/>
-        </w:rPr>
-        <w:t>La pregunta de diseno real no es si poner clave primaria, sino cual.</w:t>
-      </w:r>
-    </w:p>
-    <w:p>
-      <w:pPr>
-        <w:pStyle w:val="ListBullet2"/>
-      </w:pPr>
-      <w:r>
-        <w:rPr>
-          <w:b w:val="0"/>
-          <w:color w:val="4A4A49"/>
-          <w:sz w:val="22"/>
-        </w:rPr>
-        <w:t>Una clave natural es un atributo del mundo real que ya identifica la entidad: la cedula del dueno, el microchip de la mascota.</w:t>
-      </w:r>
-    </w:p>
-    <w:p>
-      <w:pPr>
-        <w:pStyle w:val="ListBullet2"/>
-      </w:pPr>
-      <w:r>
-        <w:rPr>
-          <w:b w:val="0"/>
-          <w:color w:val="4A4A49"/>
-          <w:sz w:val="22"/>
-        </w:rPr>
-        <w:t>Una clave sustituta, o surrogate, es un numero sin significado de negocio que la base genera: id_dueno 1, 2, 3.</w:t>
-      </w:r>
-    </w:p>
-    <w:p>
-      <w:pPr>
-        <w:pStyle w:val="ListBullet2"/>
-      </w:pPr>
-      <w:r>
-        <w:rPr>
-          <w:b w:val="0"/>
-          <w:color w:val="4A4A49"/>
-          <w:sz w:val="22"/>
-        </w:rPr>
-        <w:t>En la clínica pasan las tres cosas: el dueno llega sin cedula a la mano, un microchip se digita mal y hay que corregirlo, y una mascota rescatada no tiene microchip.</w:t>
-      </w:r>
-    </w:p>
-    <w:p>
-      <w:pPr>
-        <w:pStyle w:val="ListBullet2"/>
-      </w:pPr>
-      <w:r>
-        <w:rPr>
-          <w:b w:val="0"/>
-          <w:color w:val="4A4A49"/>
-          <w:sz w:val="22"/>
-        </w:rPr>
-        <w:t>Regla citable, y es convencion de oficio, no regla dura: si el valor lo controla un tercero, el Estado o un fabricante, no lo use como clave primaria.</w:t>
-      </w:r>
-    </w:p>
-    <w:p>
-      <w:pPr>
-        <w:pStyle w:val="ListBullet2"/>
-      </w:pPr>
-      <w:r>
-        <w:rPr>
-          <w:b w:val="0"/>
-          <w:color w:val="4A4A49"/>
-          <w:sz w:val="22"/>
-        </w:rPr>
-        <w:t>NOTAS:</w:t>
-      </w:r>
-    </w:p>
-    <w:p>
-      <w:pPr>
-        <w:pStyle w:val="ListBullet2"/>
-      </w:pPr>
-      <w:r>
-        <w:rPr>
-          <w:b w:val="0"/>
-          <w:color w:val="4A4A49"/>
-          <w:sz w:val="22"/>
-        </w:rPr>
-        <w:t>Eso no es estilo, es una restriccion que el motor verifica en cada INSERT y UPDATE y que rechaza con error.</w:t>
-      </w:r>
-    </w:p>
-    <w:p>
-      <w:pPr>
-        <w:pStyle w:val="ListBullet2"/>
-      </w:pPr>
-      <w:r>
-        <w:rPr>
-          <w:b w:val="0"/>
-          <w:color w:val="4A4A49"/>
-          <w:sz w:val="22"/>
-        </w:rPr>
-        <w:t>La natural ahorra un JOIN cuando se busca por ella; la sustituta gana cuando el dato natural cambia, se repite o todavia no existe.</w:t>
-      </w:r>
-    </w:p>
-    <w:p>
-      <w:pPr>
-        <w:pStyle w:val="ListBullet2"/>
-      </w:pPr>
-      <w:r>
-        <w:rPr>
-          <w:b w:val="0"/>
-          <w:color w:val="4A4A49"/>
-          <w:sz w:val="22"/>
-        </w:rPr>
-        <w:t>Por eso el esquema usa identificadores sustitutos y guarda el dato natural aparte con unicidad:.</w:t>
-      </w:r>
-    </w:p>
-    <w:p>
-      <w:pPr>
-        <w:pStyle w:val="ListBullet2"/>
-      </w:pPr>
-      <w:r>
-        <w:rPr>
-          <w:b w:val="0"/>
-          <w:color w:val="4A4A49"/>
-          <w:sz w:val="22"/>
-        </w:rPr>
-        <w:t>UNIQUE impide dos duenos con la misma cedula, permite dejarla nula un rato y permite corregirla sin tocar las filas de mascota que apuntan al dueno.</w:t>
-      </w:r>
-    </w:p>
-    <w:p>
-      <w:pPr>
-        <w:pStyle w:val="ListBullet2"/>
-      </w:pPr>
-      <w:r>
-        <w:rPr>
-          <w:b w:val="0"/>
-          <w:color w:val="4A4A49"/>
-          <w:sz w:val="22"/>
-        </w:rPr>
-        <w:t>CÓDIGO CITADO (referencia):</w:t>
-      </w:r>
-    </w:p>
-    <w:p>
-      <w:pPr>
-        <w:pStyle w:val="ListBullet2"/>
-      </w:pPr>
-      <w:r>
-        <w:rPr>
-          <w:b w:val="0"/>
-          <w:color w:val="4A4A49"/>
-          <w:sz w:val="22"/>
-        </w:rPr>
-        <w:t>CREATE TABLE dueno (id_dueno INT PRIMARY KEY, cedula VARCHAR(20) UNIQUE, nombre VARCHAR(80) NOT NULL, telefono VARCHAR(30), email VARCHAR(120))</w:t>
-      </w:r>
-    </w:p>
-    <w:p>
-      <w:r>
-        <w:rPr>
-          <w:b/>
-          <w:color w:val="4A4A49"/>
-          <w:sz w:val="22"/>
-        </w:rPr>
-        <w:t>[Slide 12] Normalizacion 1FN-3FN: primero la enfermedad</w:t>
-      </w:r>
-      <w:r>
-        <w:rPr>
-          <w:b w:val="0"/>
-          <w:color w:val="4A4A49"/>
-          <w:sz w:val="22"/>
-        </w:rPr>
-        <w:t xml:space="preserve"> — 4 vinetas.</w:t>
-      </w:r>
-    </w:p>
-    <w:p>
-      <w:pPr>
-        <w:pStyle w:val="ListBullet2"/>
-      </w:pPr>
-      <w:r>
-        <w:rPr>
-          <w:b w:val="0"/>
-          <w:color w:val="4A4A49"/>
-          <w:sz w:val="22"/>
-        </w:rPr>
-        <w:t>DESARROLLO (para explicarlo, no se proyecta):</w:t>
-      </w:r>
-    </w:p>
-    <w:p>
-      <w:pPr>
-        <w:pStyle w:val="ListBullet2"/>
-      </w:pPr>
-      <w:r>
-        <w:rPr>
-          <w:b w:val="0"/>
-          <w:color w:val="4A4A49"/>
-          <w:sz w:val="22"/>
-        </w:rPr>
-        <w:t>La normalizacion se dicta mejor al reves de como se suele dictar: primero la enfermedad.</w:t>
-      </w:r>
-    </w:p>
-    <w:p>
-      <w:pPr>
-        <w:pStyle w:val="ListBullet2"/>
-      </w:pPr>
-      <w:r>
-        <w:rPr>
-          <w:b w:val="0"/>
-          <w:color w:val="4A4A49"/>
-          <w:sz w:val="22"/>
-        </w:rPr>
-        <w:t>De actualizacion: cuando Ana Perez cambia de telefono hay que actualizar todas sus citas, y si una queda sin actualizar la base contiene dos verdades contradictorias.</w:t>
-      </w:r>
-    </w:p>
-    <w:p>
-      <w:pPr>
-        <w:pStyle w:val="ListBullet2"/>
-      </w:pPr>
-      <w:r>
-        <w:rPr>
-          <w:b w:val="0"/>
-          <w:color w:val="4A4A49"/>
-          <w:sz w:val="22"/>
-        </w:rPr>
-        <w:t>De insercion: no se puede registrar un dueno nuevo hasta que tenga una cita, porque el dato solo vive en cita.</w:t>
-      </w:r>
-    </w:p>
-    <w:p>
-      <w:pPr>
-        <w:pStyle w:val="ListBullet2"/>
-      </w:pPr>
-      <w:r>
-        <w:rPr>
-          <w:b w:val="0"/>
-          <w:color w:val="4A4A49"/>
-          <w:sz w:val="22"/>
-        </w:rPr>
-        <w:t>De borrado: al eliminar la ultima cita desaparece el telefono.</w:t>
-      </w:r>
-    </w:p>
-    <w:p>
-      <w:pPr>
-        <w:pStyle w:val="ListBullet2"/>
-      </w:pPr>
-      <w:r>
-        <w:rPr>
-          <w:b w:val="0"/>
-          <w:color w:val="4A4A49"/>
-          <w:sz w:val="22"/>
-        </w:rPr>
-        <w:t>Primera: nada de listas en una celda; guardar 3001112233 y 3159998877 juntos obliga a buscar con SUBSTR, no se puede indexar y no se sabe cual esta vigente, luego se crea telefono_dueno.</w:t>
-      </w:r>
-    </w:p>
-    <w:p>
-      <w:pPr>
-        <w:pStyle w:val="ListBullet2"/>
-      </w:pPr>
-      <w:r>
-        <w:rPr>
-          <w:b w:val="0"/>
-          <w:color w:val="4A4A49"/>
-          <w:sz w:val="22"/>
-        </w:rPr>
-        <w:t>Segunda: en detalle_factura, con clave compuesta (id_factura, id_insumo), un atributo como nombre_insumo depende solo de id_insumo y sale hacia insumo; en cambio precio_unitario se queda</w:t>
-      </w:r>
-    </w:p>
-    <w:p>
-      <w:pPr>
-        <w:pStyle w:val="ListBullet2"/>
-      </w:pPr>
-      <w:r>
-        <w:rPr>
-          <w:b w:val="0"/>
-          <w:color w:val="4A4A49"/>
-          <w:sz w:val="22"/>
-        </w:rPr>
-        <w:t>Y este matiz separa a quien entendio de quien memorizo, porque no es redundancia sino el precio historico del momento de la venta: si el total se recalcula con el precio actual, reimprimir una factura de hace seis meses da otra cifra.</w:t>
-      </w:r>
-    </w:p>
-    <w:p>
-      <w:pPr>
-        <w:pStyle w:val="ListBullet2"/>
-      </w:pPr>
-      <w:r>
-        <w:rPr>
-          <w:b w:val="0"/>
-          <w:color w:val="4A4A49"/>
-          <w:sz w:val="22"/>
-        </w:rPr>
-        <w:t>Tercera: si cita guardara especialidad_veterinario, ese atributo depende de id_veterinario y no de id_cita, luego sale hacia veterinario.</w:t>
-      </w:r>
-    </w:p>
-    <w:p>
-      <w:pPr>
-        <w:pStyle w:val="ListBullet2"/>
-      </w:pPr>
-      <w:r>
-        <w:rPr>
-          <w:b w:val="0"/>
-          <w:color w:val="4A4A49"/>
-          <w:sz w:val="22"/>
-        </w:rPr>
-        <w:t>La tercera forma normal es el punto de parada practico en casi todo sistema transaccional</w:t>
-      </w:r>
-    </w:p>
-    <w:p>
-      <w:pPr>
-        <w:pStyle w:val="ListBullet2"/>
-      </w:pPr>
-      <w:r>
-        <w:rPr>
-          <w:b w:val="0"/>
-          <w:color w:val="4A4A49"/>
-          <w:sz w:val="22"/>
-        </w:rPr>
-        <w:t>Y eso es convencion; se rompe a proposito cuando conviene, por ejemplo guardando el total ya calculado en factura, decision que se sostiene con un disparador de la Clase 4 y se justifica con planes de ejecucion en las Clases 6 y 7.</w:t>
-      </w:r>
-    </w:p>
-    <w:p>
-      <w:pPr>
-        <w:pStyle w:val="ListBullet2"/>
-      </w:pPr>
-      <w:r>
-        <w:rPr>
-          <w:b w:val="0"/>
-          <w:color w:val="4A4A49"/>
-          <w:sz w:val="22"/>
-        </w:rPr>
-        <w:t>NOTAS:</w:t>
-      </w:r>
-    </w:p>
-    <w:p>
-      <w:pPr>
-        <w:pStyle w:val="ListBullet2"/>
-      </w:pPr>
-      <w:r>
-        <w:rPr>
-          <w:b w:val="0"/>
-          <w:color w:val="4A4A49"/>
-          <w:sz w:val="22"/>
-        </w:rPr>
-        <w:t>Supongamos que el estudiante guarda el telefono del dueno dentro de cada fila de cita.</w:t>
-      </w:r>
-    </w:p>
-    <w:p>
-      <w:pPr>
-        <w:pStyle w:val="ListBullet2"/>
-      </w:pPr>
-      <w:r>
-        <w:rPr>
-          <w:b w:val="0"/>
-          <w:color w:val="4A4A49"/>
-          <w:sz w:val="22"/>
-        </w:rPr>
-        <w:t>Aparecen tres anomalias.</w:t>
-      </w:r>
-    </w:p>
-    <w:p>
-      <w:pPr>
-        <w:pStyle w:val="ListBullet2"/>
-      </w:pPr>
-      <w:r>
-        <w:rPr>
-          <w:b w:val="0"/>
-          <w:color w:val="4A4A49"/>
-          <w:sz w:val="22"/>
-        </w:rPr>
-        <w:t>Leidas asi, las tres formas normales son tres vacunas.</w:t>
-      </w:r>
-    </w:p>
-    <w:p>
-      <w:r>
-        <w:rPr>
-          <w:b/>
-          <w:color w:val="4A4A49"/>
-          <w:sz w:val="22"/>
-        </w:rPr>
-        <w:t>[Slide 13] Clave foranea, borrado y por que la FK no basta</w:t>
-      </w:r>
-      <w:r>
-        <w:rPr>
-          <w:b w:val="0"/>
-          <w:color w:val="4A4A49"/>
-          <w:sz w:val="22"/>
-        </w:rPr>
-        <w:t xml:space="preserve"> — 3 vinetas.</w:t>
-      </w:r>
-    </w:p>
-    <w:p>
-      <w:pPr>
-        <w:pStyle w:val="ListBullet2"/>
-      </w:pPr>
-      <w:r>
-        <w:rPr>
-          <w:b w:val="0"/>
-          <w:color w:val="4A4A49"/>
-          <w:sz w:val="22"/>
-        </w:rPr>
-        <w:t>DESARROLLO (para explicarlo, no se proyecta):</w:t>
-      </w:r>
-    </w:p>
-    <w:p>
-      <w:pPr>
-        <w:pStyle w:val="ListBullet2"/>
-      </w:pPr>
-      <w:r>
-        <w:rPr>
-          <w:b w:val="0"/>
-          <w:color w:val="4A4A49"/>
-          <w:sz w:val="22"/>
-        </w:rPr>
-        <w:t>La clave foranea apunta a la clave primaria de otra tabla y su efecto practico es que el motor se niega a guardar una referencia inventada.</w:t>
-      </w:r>
-    </w:p>
-    <w:p>
-      <w:pPr>
-        <w:pStyle w:val="ListBullet2"/>
-      </w:pPr>
-      <w:r>
-        <w:rPr>
-          <w:b w:val="0"/>
-          <w:color w:val="4A4A49"/>
-          <w:sz w:val="22"/>
-        </w:rPr>
-        <w:t>Si se intenta y la mascota 999 no existe, la sentencia falla y nombra la restriccion violada: eso es integridad referencial.</w:t>
-      </w:r>
-    </w:p>
-    <w:p>
-      <w:pPr>
-        <w:pStyle w:val="ListBullet2"/>
-      </w:pPr>
-      <w:r>
-        <w:rPr>
-          <w:b w:val="0"/>
-          <w:color w:val="4A4A49"/>
-          <w:sz w:val="22"/>
-        </w:rPr>
-        <w:t>Si no se especifica nada, Oracle y PostgreSQL asumen el comportamiento restrictivo, y esa es regla dura del estandar, no convencion.</w:t>
-      </w:r>
-    </w:p>
-    <w:p>
-      <w:pPr>
-        <w:pStyle w:val="ListBullet2"/>
-      </w:pPr>
-      <w:r>
-        <w:rPr>
-          <w:b w:val="0"/>
-          <w:color w:val="4A4A49"/>
-          <w:sz w:val="22"/>
-        </w:rPr>
-        <w:t>En la clínica se decide entidad por entidad: mascota hacia dueno restrictivo, porque borrar un dueno no debe evaporar el historial clinico; consulta hacia cita restrictivo</w:t>
-      </w:r>
-    </w:p>
-    <w:p>
-      <w:pPr>
-        <w:pStyle w:val="ListBullet2"/>
-      </w:pPr>
-      <w:r>
-        <w:rPr>
-          <w:b w:val="0"/>
-          <w:color w:val="4A4A49"/>
-          <w:sz w:val="22"/>
-        </w:rPr>
-        <w:t>Porque la consulta es el registro medico; detalle_factura hacia factura en cascada, porque una linea de detalle no significa nada sin su factura; detalle_factura hacia insumo restrictivo, porque no se puede borrar un insumo ya facturado.</w:t>
-      </w:r>
-    </w:p>
-    <w:p>
-      <w:pPr>
-        <w:pStyle w:val="ListBullet2"/>
-      </w:pPr>
-      <w:r>
-        <w:rPr>
-          <w:b w:val="0"/>
-          <w:color w:val="4A4A49"/>
-          <w:sz w:val="22"/>
-        </w:rPr>
-        <w:t>La conclusion honesta es que en produccion casi nada se borra: se marca inactivo con activa CHAR(1) DEFAULT 'S' CHECK (activa IN ('S','N')).</w:t>
-      </w:r>
-    </w:p>
-    <w:p>
-      <w:pPr>
-        <w:pStyle w:val="ListBullet2"/>
-      </w:pPr>
-      <w:r>
-        <w:rPr>
-          <w:b w:val="0"/>
-          <w:color w:val="4A4A49"/>
-          <w:sz w:val="22"/>
-        </w:rPr>
-        <w:t>La accion ante el borrado del padre se declara en la propia FK: ON DELETE RESTRICT, o NO ACTION, que es la opcion por omision, impide borrar un dueno con mascotas</w:t>
-      </w:r>
-    </w:p>
-    <w:p>
-      <w:pPr>
-        <w:pStyle w:val="ListBullet2"/>
-      </w:pPr>
-      <w:r>
-        <w:rPr>
-          <w:b w:val="0"/>
-          <w:color w:val="4A4A49"/>
-          <w:sz w:val="22"/>
-        </w:rPr>
-        <w:t>ON DELETE CASCADE borraria tambien sus mascotas y citas, que en una clinica es perder historia clinica</w:t>
-      </w:r>
-    </w:p>
-    <w:p>
-      <w:pPr>
-        <w:pStyle w:val="ListBullet2"/>
-      </w:pPr>
-      <w:r>
-        <w:rPr>
-          <w:b w:val="0"/>
-          <w:color w:val="4A4A49"/>
-          <w:sz w:val="22"/>
-        </w:rPr>
-        <w:t>En la clínica la eleccion razonable es RESTRICT mas baja logica.</w:t>
-      </w:r>
-    </w:p>
-    <w:p>
-      <w:pPr>
-        <w:pStyle w:val="ListBullet2"/>
-      </w:pPr>
-      <w:r>
-        <w:rPr>
-          <w:b w:val="0"/>
-          <w:color w:val="4A4A49"/>
-          <w:sz w:val="22"/>
-        </w:rPr>
-        <w:t>NOTAS:</w:t>
-      </w:r>
-    </w:p>
-    <w:p>
-      <w:pPr>
-        <w:pStyle w:val="ListBullet2"/>
-      </w:pPr>
-      <w:r>
-        <w:rPr>
-          <w:b w:val="0"/>
-          <w:color w:val="4A4A49"/>
-          <w:sz w:val="22"/>
-        </w:rPr>
-        <w:t>Lo que casi nunca se explica es la otra mitad: que pasa al borrar el padre.</w:t>
-      </w:r>
-    </w:p>
-    <w:p>
-      <w:pPr>
-        <w:pStyle w:val="ListBullet2"/>
-      </w:pPr>
-      <w:r>
-        <w:rPr>
-          <w:b w:val="0"/>
-          <w:color w:val="4A4A49"/>
-          <w:sz w:val="22"/>
-        </w:rPr>
-        <w:t>Al declarar la clave foranea se elige el comportamiento</w:t>
-      </w:r>
-    </w:p>
-    <w:p>
-      <w:pPr>
-        <w:pStyle w:val="ListBullet2"/>
-      </w:pPr>
-      <w:r>
-        <w:rPr>
-          <w:b w:val="0"/>
-          <w:color w:val="4A4A49"/>
-          <w:sz w:val="22"/>
-        </w:rPr>
-        <w:t>RESTRICT o NO ACTION impide borrar el dueno mientras tenga mascotas, CASCADE borra las filas hijas en cadena y SET NULL deja la referencia nula.</w:t>
-      </w:r>
-    </w:p>
-    <w:p>
-      <w:pPr>
-        <w:pStyle w:val="ListBullet2"/>
-      </w:pPr>
-      <w:r>
-        <w:rPr>
-          <w:b w:val="0"/>
-          <w:color w:val="4A4A49"/>
-          <w:sz w:val="22"/>
-        </w:rPr>
-        <w:t>Esa baja logica es la que obliga a validar en la Clase 3 que una mascota inactiva no agende, porque la clave foranea la sigue aceptando: el identificador existe, el negocio no lo quiere.</w:t>
-      </w:r>
-    </w:p>
-    <w:p>
-      <w:pPr>
-        <w:pStyle w:val="ListBullet2"/>
-      </w:pPr>
-      <w:r>
-        <w:rPr>
-          <w:b w:val="0"/>
-          <w:color w:val="4A4A49"/>
-          <w:sz w:val="22"/>
-        </w:rPr>
-        <w:t>ON DELETE SET NULL deja la fila huerfana con la columna en nulo.</w:t>
-      </w:r>
-    </w:p>
-    <w:p>
-      <w:pPr>
-        <w:pStyle w:val="ListBullet2"/>
-      </w:pPr>
-      <w:r>
-        <w:rPr>
-          <w:b w:val="0"/>
-          <w:color w:val="4A4A49"/>
-          <w:sz w:val="22"/>
-        </w:rPr>
-        <w:t>CÓDIGO CITADO (referencia):</w:t>
-      </w:r>
-    </w:p>
-    <w:p>
-      <w:pPr>
-        <w:pStyle w:val="ListBullet2"/>
-      </w:pPr>
-      <w:r>
-        <w:rPr>
-          <w:b w:val="0"/>
-          <w:color w:val="4A4A49"/>
-          <w:sz w:val="22"/>
-        </w:rPr>
-        <w:t>INSERT INTO cita (id_cita, id_mascota, fecha_hora, estado) VALUES (101, 999, TIMESTAMP '2026-09-01 09:00:00', 'PROGRAMADA')</w:t>
-      </w:r>
-    </w:p>
-    <w:p>
-      <w:r>
-        <w:rPr>
-          <w:b/>
-          <w:color w:val="4A4A49"/>
-          <w:sz w:val="22"/>
-        </w:rPr>
-        <w:t>[Slide 14] La clave foranea y que pasa al borrar el padre</w:t>
-      </w:r>
-      <w:r>
-        <w:rPr>
-          <w:b w:val="0"/>
-          <w:color w:val="4A4A49"/>
-          <w:sz w:val="22"/>
-        </w:rPr>
-        <w:t xml:space="preserve"> — 13 vinetas.</w:t>
-      </w:r>
-    </w:p>
-    <w:p>
-      <w:r>
-        <w:rPr>
-          <w:b/>
-          <w:color w:val="4A4A49"/>
-          <w:sz w:val="22"/>
-        </w:rPr>
-        <w:t>[Slide 15] Integridad referencial: el error que devuelve el motor</w:t>
-      </w:r>
-      <w:r>
-        <w:rPr>
-          <w:b w:val="0"/>
-          <w:color w:val="4A4A49"/>
-          <w:sz w:val="22"/>
-        </w:rPr>
-        <w:t xml:space="preserve"> — 10 vinetas.</w:t>
-      </w:r>
-    </w:p>
-    <w:p>
-      <w:r>
-        <w:rPr>
-          <w:b/>
-          <w:color w:val="4A4A49"/>
-          <w:sz w:val="22"/>
-        </w:rPr>
-        <w:t>[Slide 16] Baja logica: activa CHAR(1) en vez de DELETE</w:t>
-      </w:r>
-      <w:r>
-        <w:rPr>
-          <w:b w:val="0"/>
-          <w:color w:val="4A4A49"/>
-          <w:sz w:val="22"/>
-        </w:rPr>
-        <w:t xml:space="preserve"> — 4 vinetas.</w:t>
-      </w:r>
-    </w:p>
-    <w:p>
-      <w:pPr>
-        <w:pStyle w:val="ListBullet2"/>
-      </w:pPr>
-      <w:r>
-        <w:rPr>
-          <w:b w:val="0"/>
-          <w:color w:val="4A4A49"/>
-          <w:sz w:val="22"/>
-        </w:rPr>
-        <w:t>DESARROLLO (para explicarlo, no se proyecta):</w:t>
-      </w:r>
-    </w:p>
-    <w:p>
-      <w:pPr>
-        <w:pStyle w:val="ListBullet2"/>
-      </w:pPr>
-      <w:r>
-        <w:rPr>
-          <w:b w:val="0"/>
-          <w:color w:val="4A4A49"/>
-          <w:sz w:val="22"/>
-        </w:rPr>
-        <w:t>En un sistema real no se borran clientes ni pacientes: no se hace DELETE FROM mascota.</w:t>
-      </w:r>
-    </w:p>
-    <w:p>
-      <w:pPr>
-        <w:pStyle w:val="ListBullet2"/>
-      </w:pPr>
-      <w:r>
-        <w:rPr>
-          <w:b w:val="0"/>
-          <w:color w:val="4A4A49"/>
-          <w:sz w:val="22"/>
-        </w:rPr>
-        <w:t>Primero por integridad, porque la fila esta referenciada por citas, consultas y facturas y el motor lo va a impedir; segundo por trazabilidad</w:t>
-      </w:r>
-    </w:p>
-    <w:p>
-      <w:pPr>
-        <w:pStyle w:val="ListBullet2"/>
-      </w:pPr>
-      <w:r>
-        <w:rPr>
-          <w:b w:val="0"/>
-          <w:color w:val="4A4A49"/>
-          <w:sz w:val="22"/>
-        </w:rPr>
-        <w:t>Porque el historial clinico y la facturacion de esa mascota tienen que seguir existiendo aunque la mascota ya no venga; y tercero porque un borrado es irreversible y una equivocacion de digitacion no deberia serlo.</w:t>
-      </w:r>
-    </w:p>
-    <w:p>
-      <w:pPr>
-        <w:pStyle w:val="ListBullet2"/>
-      </w:pPr>
-      <w:r>
-        <w:rPr>
-          <w:b w:val="0"/>
-          <w:color w:val="4A4A49"/>
-          <w:sz w:val="22"/>
-        </w:rPr>
-        <w:t>La regla vive en otra capa: un CHECK si solo mira columnas de la misma fila, un procedimiento almacenado si necesita consultar otra tabla (Clase 3), o un disparador si debe aplicarse aunque nadie llame al procedimiento (Clase 4).</w:t>
-      </w:r>
-    </w:p>
-    <w:p>
-      <w:pPr>
-        <w:pStyle w:val="ListBullet2"/>
-      </w:pPr>
-      <w:r>
-        <w:rPr>
-          <w:b w:val="0"/>
-          <w:color w:val="4A4A49"/>
-          <w:sz w:val="22"/>
-        </w:rPr>
-        <w:t>NOTAS:</w:t>
-      </w:r>
-    </w:p>
-    <w:p>
-      <w:pPr>
-        <w:pStyle w:val="ListBullet2"/>
-      </w:pPr>
-      <w:r>
-        <w:rPr>
-          <w:b w:val="0"/>
-          <w:color w:val="4A4A49"/>
-          <w:sz w:val="22"/>
-        </w:rPr>
-        <w:t>Conviene detenerse en la baja logica porque es la decision que sostiene medio semestre y casi nunca se explica.</w:t>
-      </w:r>
-    </w:p>
-    <w:p>
-      <w:pPr>
-        <w:pStyle w:val="ListBullet2"/>
-      </w:pPr>
-      <w:r>
-        <w:rPr>
-          <w:b w:val="0"/>
-          <w:color w:val="4A4A49"/>
-          <w:sz w:val="22"/>
-        </w:rPr>
-        <w:t>Lo que se hace es marcar la fila como inactiva: activa CHAR(1) DEFAULT 'S' CHECK (activa IN ('S','N')), y las consultas del dia a dia filtran WHERE activa = 'S'.</w:t>
-      </w:r>
-    </w:p>
-    <w:p>
-      <w:pPr>
-        <w:pStyle w:val="ListBullet2"/>
-      </w:pPr>
-      <w:r>
-        <w:rPr>
-          <w:b w:val="0"/>
-          <w:color w:val="4A4A49"/>
-          <w:sz w:val="22"/>
-        </w:rPr>
-        <w:t>La consecuencia que hay que subrayar, porque es la que abre la Clase 3, es que la clave foranea NO defiende esa regla: para el motor, la mascota inactiva existe y su identificador es valido, asi que aceptara sin chistar una cita nueva sobre ella.</w:t>
-      </w:r>
-    </w:p>
-    <w:p>
-      <w:pPr>
-        <w:pStyle w:val="ListBullet2"/>
-      </w:pPr>
-      <w:r>
-        <w:rPr>
-          <w:b w:val="0"/>
-          <w:color w:val="4A4A49"/>
-          <w:sz w:val="22"/>
-        </w:rPr>
-        <w:t>Si el estudiante sale hoy con DELETE en la cabeza, en la Clase 3 no va a entender por que hace falta sp_agendar_cita.</w:t>
-      </w:r>
-    </w:p>
-    <w:p>
-      <w:r>
-        <w:rPr>
-          <w:b/>
-          <w:color w:val="4A4A49"/>
-          <w:sz w:val="22"/>
-        </w:rPr>
-        <w:t>[Slide 17] Lo que el DDL NO puede defender solo</w:t>
-      </w:r>
-      <w:r>
-        <w:rPr>
-          <w:b w:val="0"/>
-          <w:color w:val="4A4A49"/>
-          <w:sz w:val="22"/>
-        </w:rPr>
-        <w:t xml:space="preserve"> — 10 vinetas.</w:t>
-      </w:r>
-    </w:p>
-    <w:p>
-      <w:r>
-        <w:rPr>
-          <w:b/>
-          <w:color w:val="4A4A49"/>
-          <w:sz w:val="22"/>
-        </w:rPr>
-        <w:t>[Slide 18] Que separa un diagrama ER de un dibujo</w:t>
-      </w:r>
-      <w:r>
-        <w:rPr>
-          <w:b w:val="0"/>
-          <w:color w:val="4A4A49"/>
-          <w:sz w:val="22"/>
-        </w:rPr>
-        <w:t xml:space="preserve"> — 4 vinetas.</w:t>
-      </w:r>
-    </w:p>
-    <w:p>
-      <w:pPr>
-        <w:pStyle w:val="ListBullet2"/>
-      </w:pPr>
-      <w:r>
-        <w:rPr>
-          <w:b w:val="0"/>
-          <w:color w:val="4A4A49"/>
-          <w:sz w:val="22"/>
-        </w:rPr>
-        <w:t>DESARROLLO (para explicarlo, no se proyecta):</w:t>
-      </w:r>
-    </w:p>
-    <w:p>
-      <w:pPr>
-        <w:pStyle w:val="ListBullet2"/>
-      </w:pPr>
-      <w:r>
-        <w:rPr>
-          <w:b w:val="0"/>
-          <w:color w:val="4A4A49"/>
-          <w:sz w:val="22"/>
-        </w:rPr>
-        <w:t>Hace falta distinguir un diagrama entidad-relacion de un dibujo, porque es facil hacer lo segundo creyendo que es lo primero.</w:t>
-      </w:r>
-    </w:p>
-    <w:p>
-      <w:pPr>
-        <w:pStyle w:val="ListBullet2"/>
-      </w:pPr>
-      <w:r>
-        <w:rPr>
-          <w:b w:val="0"/>
-          <w:color w:val="4A4A49"/>
-          <w:sz w:val="22"/>
-        </w:rPr>
-        <w:t>Un dibujo son cajas con nombres unidas por lineas.</w:t>
-      </w:r>
-    </w:p>
-    <w:p>
-      <w:pPr>
-        <w:pStyle w:val="ListBullet2"/>
-      </w:pPr>
-      <w:r>
-        <w:rPr>
-          <w:b w:val="0"/>
-          <w:color w:val="4A4A49"/>
-          <w:sz w:val="22"/>
-        </w:rPr>
-        <w:t>Un diagrama bien hecho cumple cinco condiciones verificables: entidades en singular con su clave primaria marcada; cada atributo con tipo y longitud, no solo nombre</w:t>
-      </w:r>
-    </w:p>
-    <w:p>
-      <w:pPr>
-        <w:pStyle w:val="ListBullet2"/>
-      </w:pPr>
-      <w:r>
-        <w:rPr>
-          <w:b w:val="0"/>
-          <w:color w:val="4A4A49"/>
-          <w:sz w:val="22"/>
-        </w:rPr>
-        <w:t>Cada clave foranea senalada indicando a que entidad apunta; cada relacion con cardinalidad en los dos extremos, con maximo y minimo; y cada relacion con nombre verbal legible, Dueno posee Mascota, Veterinario atiende Cita.</w:t>
-      </w:r>
-    </w:p>
-    <w:p>
-      <w:pPr>
-        <w:pStyle w:val="ListBullet2"/>
-      </w:pPr>
-      <w:r>
-        <w:rPr>
-          <w:b w:val="0"/>
-          <w:color w:val="4A4A49"/>
-          <w:sz w:val="22"/>
-        </w:rPr>
-        <w:t>El criterio de aceptacion que conviene entregar es operativo: el diagrama esta bien si otra persona puede escribir el CREATE TABLE completo mirandolo, sin preguntar nada.</w:t>
-      </w:r>
-    </w:p>
-    <w:p>
-      <w:pPr>
-        <w:pStyle w:val="ListBullet2"/>
-      </w:pPr>
-      <w:r>
-        <w:rPr>
-          <w:b w:val="0"/>
-          <w:color w:val="4A4A49"/>
-          <w:sz w:val="22"/>
-        </w:rPr>
-        <w:t>La opcionalidad es la parte que siempre se omite y la que mas cuesta despues.</w:t>
-      </w:r>
-    </w:p>
-    <w:p>
-      <w:pPr>
-        <w:pStyle w:val="ListBullet2"/>
-      </w:pPr>
-      <w:r>
-        <w:rPr>
-          <w:b w:val="0"/>
-          <w:color w:val="4A4A49"/>
-          <w:sz w:val="22"/>
-        </w:rPr>
-        <w:t>En la clínica, Consulta y Cita estan en relacion uno a uno pero no simetrica: una cita programada aun no tiene consulta, y una consulta no existe sin su cita.</w:t>
-      </w:r>
-    </w:p>
-    <w:p>
-      <w:pPr>
-        <w:pStyle w:val="ListBullet2"/>
-      </w:pPr>
-      <w:r>
-        <w:rPr>
-          <w:b w:val="0"/>
-          <w:color w:val="4A4A49"/>
-          <w:sz w:val="22"/>
-        </w:rPr>
-        <w:t>Como referencia de tamano, el modelo tiene ocho entidades y siete relaciones y debe caber legible en una hoja; si no cabe, se divide en vistas por subsistema, y eso es convencion, no norma.</w:t>
-      </w:r>
-    </w:p>
-    <w:p>
-      <w:pPr>
-        <w:pStyle w:val="ListBullet2"/>
-      </w:pPr>
-      <w:r>
-        <w:rPr>
-          <w:b w:val="0"/>
-          <w:color w:val="4A4A49"/>
-          <w:sz w:val="22"/>
-        </w:rPr>
-        <w:t>NOTAS:</w:t>
-      </w:r>
-    </w:p>
-    <w:p>
-      <w:pPr>
-        <w:pStyle w:val="ListBullet2"/>
-      </w:pPr>
-      <w:r>
-        <w:rPr>
-          <w:b w:val="0"/>
-          <w:color w:val="4A4A49"/>
-          <w:sz w:val="22"/>
-        </w:rPr>
-        <w:t>Eso se materializa como consulta.id_cita NOT NULL UNIQUE, no como una clave foranea simple, y decidirlo hoy evita la pregunta que aparece en la Clase 3 cuando alguien intenta registrar la consulta antes de la cita.</w:t>
-      </w:r>
-    </w:p>
-    <w:p>
-      <w:r>
-        <w:rPr>
-          <w:b/>
-          <w:color w:val="4A4A49"/>
-          <w:sz w:val="22"/>
-        </w:rPr>
-        <w:t>[Slide 19] Tipos de datos: donde se pagan las facturas mas caras</w:t>
-      </w:r>
-      <w:r>
-        <w:rPr>
-          <w:b w:val="0"/>
-          <w:color w:val="4A4A49"/>
-          <w:sz w:val="22"/>
-        </w:rPr>
-        <w:t xml:space="preserve"> — 4 vinetas.</w:t>
-      </w:r>
-    </w:p>
-    <w:p>
-      <w:pPr>
-        <w:pStyle w:val="ListBullet2"/>
-      </w:pPr>
-      <w:r>
-        <w:rPr>
-          <w:b w:val="0"/>
-          <w:color w:val="4A4A49"/>
-          <w:sz w:val="22"/>
-        </w:rPr>
-        <w:t>DESARROLLO (para explicarlo, no se proyecta):</w:t>
-      </w:r>
-    </w:p>
-    <w:p>
-      <w:pPr>
-        <w:pStyle w:val="ListBullet2"/>
-      </w:pPr>
-      <w:r>
-        <w:rPr>
-          <w:b w:val="0"/>
-          <w:color w:val="4A4A49"/>
-          <w:sz w:val="22"/>
-        </w:rPr>
-        <w:t>Elegir tipos parece trivial y es donde se pagan las facturas mas caras del semestre.</w:t>
-      </w:r>
-    </w:p>
-    <w:p>
-      <w:pPr>
-        <w:pStyle w:val="ListBullet2"/>
-      </w:pPr>
-      <w:r>
-        <w:rPr>
-          <w:b w:val="0"/>
-          <w:color w:val="4A4A49"/>
-          <w:sz w:val="22"/>
-        </w:rPr>
-        <w:t>Un telefono no es un numero: como NUMBER se pierden los ceros iniciales, no cabe el prefijo internacional ni una extension, asi que va VARCHAR(30).</w:t>
-      </w:r>
-    </w:p>
-    <w:p>
-      <w:pPr>
-        <w:pStyle w:val="ListBullet2"/>
-      </w:pPr>
-      <w:r>
-        <w:rPr>
-          <w:b w:val="0"/>
-          <w:color w:val="4A4A49"/>
-          <w:sz w:val="22"/>
-        </w:rPr>
-        <w:t>Una fecha no es texto: si fecha_hora fuera VARCHAR(20), el ORDER BY seria alfabetico y no cronologico, no se podrian sumar treinta minutos para calcular el fin de la cita y el indice de la Clase 7 serviria de poco; va TIMESTAMP.</w:t>
-      </w:r>
-    </w:p>
-    <w:p>
-      <w:pPr>
-        <w:pStyle w:val="ListBullet2"/>
-      </w:pPr>
-      <w:r>
-        <w:rPr>
-          <w:b w:val="0"/>
-          <w:color w:val="4A4A49"/>
-          <w:sz w:val="22"/>
-        </w:rPr>
-        <w:t>El dinero no es flotante: FLOAT representa decimales en binario y arrastra errores que, sumados en cientos de lineas de detalle_factura, hacen que el total no cuadre con sus partes; va NUMBER(12,2) en Oracle o DECIMAL(12,2) en PostgreSQL.</w:t>
-      </w:r>
-    </w:p>
-    <w:p>
-      <w:pPr>
-        <w:pStyle w:val="ListBullet2"/>
-      </w:pPr>
-      <w:r>
-        <w:rPr>
-          <w:b w:val="0"/>
-          <w:color w:val="4A4A49"/>
-          <w:sz w:val="22"/>
-        </w:rPr>
-        <w:t>La tentacion contraria, declarar todo VARCHAR(4000) por comodidad, renuncia a que la base valide algo y traslada la validacion entera a quien programe cada pantalla.</w:t>
-      </w:r>
-    </w:p>
-    <w:p>
-      <w:pPr>
-        <w:pStyle w:val="ListBullet2"/>
-      </w:pPr>
-      <w:r>
-        <w:rPr>
-          <w:b w:val="0"/>
-          <w:color w:val="4A4A49"/>
-          <w:sz w:val="22"/>
-        </w:rPr>
-        <w:t>Numeros de referencia como convencion del curso: nombre VARCHAR(80), email VARCHAR(120) porque el estandar de correo admite hasta 254 caracteres, telefono VARCHAR(30), especie VARCHAR(40).</w:t>
-      </w:r>
-    </w:p>
-    <w:p>
-      <w:pPr>
-        <w:pStyle w:val="ListBullet2"/>
-      </w:pPr>
-      <w:r>
-        <w:rPr>
-          <w:b w:val="0"/>
-          <w:color w:val="4A4A49"/>
-          <w:sz w:val="22"/>
-        </w:rPr>
-        <w:t>El costo de equivocarse no es reescribir una linea: la tabla ya tiene datos, el ALTER TABLE debe convertir cada valor, puede fallar por una sola fila invalida, bloquea la tabla mientras dura, y los procedimientos de las Clases 3 y 4 ya asumen el tipo antiguo.</w:t>
-      </w:r>
-    </w:p>
-    <w:p>
-      <w:r>
-        <w:rPr>
-          <w:b/>
-          <w:color w:val="4A4A49"/>
-          <w:sz w:val="22"/>
-        </w:rPr>
-        <w:t>[Slide 20] Convenciones de nombres para que el DDL corra a la primera</w:t>
-      </w:r>
-      <w:r>
-        <w:rPr>
-          <w:b w:val="0"/>
-          <w:color w:val="4A4A49"/>
-          <w:sz w:val="22"/>
-        </w:rPr>
-        <w:t xml:space="preserve"> — 3 vinetas.</w:t>
-      </w:r>
-    </w:p>
-    <w:p>
-      <w:pPr>
-        <w:pStyle w:val="ListBullet2"/>
-      </w:pPr>
-      <w:r>
-        <w:rPr>
-          <w:b w:val="0"/>
-          <w:color w:val="4A4A49"/>
-          <w:sz w:val="22"/>
-        </w:rPr>
-        <w:t>DESARROLLO (para explicarlo, no se proyecta):</w:t>
-      </w:r>
-    </w:p>
-    <w:p>
-      <w:pPr>
-        <w:pStyle w:val="ListBullet2"/>
-      </w:pPr>
-      <w:r>
-        <w:rPr>
-          <w:b w:val="0"/>
-          <w:color w:val="4A4A49"/>
-          <w:sz w:val="22"/>
-        </w:rPr>
-        <w:t>Todo en minusculas: PostgreSQL pliega a minuscula cualquier identificador sin comillas</w:t>
-      </w:r>
-    </w:p>
-    <w:p>
-      <w:pPr>
-        <w:pStyle w:val="ListBullet2"/>
-      </w:pPr>
-      <w:r>
-        <w:rPr>
-          <w:b w:val="0"/>
-          <w:color w:val="4A4A49"/>
-          <w:sz w:val="22"/>
-        </w:rPr>
-        <w:t>Asi que escribir CREATE TABLE Mascota y despues consultarlo entrecomillado produce un error de tabla inexistente que cuesta veinte minutos de clase encontrar; la regla practica es no usar nunca comillas dobles en identificadores.</w:t>
-      </w:r>
-    </w:p>
-    <w:p>
-      <w:pPr>
-        <w:pStyle w:val="ListBullet2"/>
-      </w:pPr>
-      <w:r>
-        <w:rPr>
-          <w:b w:val="0"/>
-          <w:color w:val="4A4A49"/>
-          <w:sz w:val="22"/>
-        </w:rPr>
-        <w:t>Nombres de tabla en singular y sin tildes ni enes: dueno, mascota, cita, veterinario, consulta, insumo, factura, detalle_factura.</w:t>
-      </w:r>
-    </w:p>
-    <w:p>
-      <w:pPr>
-        <w:pStyle w:val="ListBullet2"/>
-      </w:pPr>
-      <w:r>
-        <w:rPr>
-          <w:b w:val="0"/>
-          <w:color w:val="4A4A49"/>
-          <w:sz w:val="22"/>
-        </w:rPr>
-        <w:t>Una tabla es un conjunto de entidades del mismo tipo, pero se nombra por lo que guarda cada fila, y el singular hace que la clave foranea se lea sola: cita.id_mascota apunta a mascota.id_mascota.</w:t>
-      </w:r>
-    </w:p>
-    <w:p>
-      <w:pPr>
-        <w:pStyle w:val="ListBullet2"/>
-      </w:pPr>
-      <w:r>
-        <w:rPr>
-          <w:b w:val="0"/>
-          <w:color w:val="4A4A49"/>
-          <w:sz w:val="22"/>
-        </w:rPr>
-        <w:t>Palabras compuestas con guion bajo (detalle_factura, fecha_hora), nunca camelCase.</w:t>
-      </w:r>
-    </w:p>
-    <w:p>
-      <w:pPr>
-        <w:pStyle w:val="ListBullet2"/>
-      </w:pPr>
-      <w:r>
-        <w:rPr>
-          <w:b w:val="0"/>
-          <w:color w:val="4A4A49"/>
-          <w:sz w:val="22"/>
-        </w:rPr>
-        <w:t>Y la convencion que mas tiempo ahorra en el semestre: el mismo nombre en el diagrama, en el DDL y en el codigo Mermaid; cuando los tres coinciden, el modelo se lee una sola vez.</w:t>
-      </w:r>
-    </w:p>
-    <w:p>
-      <w:pPr>
-        <w:pStyle w:val="ListBullet2"/>
-      </w:pPr>
-      <w:r>
-        <w:rPr>
-          <w:b w:val="0"/>
-          <w:color w:val="4A4A49"/>
-          <w:sz w:val="22"/>
-        </w:rPr>
-        <w:t>Ejemplo del error mas comun: CREATE TABLE "Mascota" con comillas crea un nombre sensible a mayusculas, y despues SELECT * FROM mascota responde relation "mascota" does not exist.</w:t>
-      </w:r>
-    </w:p>
-    <w:p>
-      <w:pPr>
-        <w:pStyle w:val="ListBullet2"/>
-      </w:pPr>
-      <w:r>
-        <w:rPr>
-          <w:b w:val="0"/>
-          <w:color w:val="4A4A49"/>
-          <w:sz w:val="22"/>
-        </w:rPr>
-        <w:t>Sin comillas, Mascota, MASCOTA y mascota son el mismo objeto.</w:t>
-      </w:r>
-    </w:p>
-    <w:p>
-      <w:pPr>
-        <w:pStyle w:val="ListBullet2"/>
-      </w:pPr>
-      <w:r>
-        <w:rPr>
-          <w:b w:val="0"/>
-          <w:color w:val="4A4A49"/>
-          <w:sz w:val="22"/>
-        </w:rPr>
-        <w:t>NOTAS:</w:t>
-      </w:r>
-    </w:p>
-    <w:p>
-      <w:pPr>
-        <w:pStyle w:val="ListBullet2"/>
-      </w:pPr>
-      <w:r>
-        <w:rPr>
-          <w:b w:val="0"/>
-          <w:color w:val="4A4A49"/>
-          <w:sz w:val="22"/>
-        </w:rPr>
-        <w:t>Convenciones de nombres del curso.</w:t>
-      </w:r>
-    </w:p>
-    <w:p>
-      <w:pPr>
-        <w:pStyle w:val="ListBullet2"/>
-      </w:pPr>
-      <w:r>
-        <w:rPr>
-          <w:b w:val="0"/>
-          <w:color w:val="4A4A49"/>
-          <w:sz w:val="22"/>
-        </w:rPr>
-        <w:t>Identificadores sustitutos uniformes con el patron id_&lt;entidad&gt;, el mismo nombre en la tabla propia y en la que la referencia, para que el JOIN se escriba sin buscar como se llamo la columna alla.</w:t>
-      </w:r>
-    </w:p>
-    <w:p>
-      <w:pPr>
-        <w:pStyle w:val="ListBullet2"/>
-      </w:pPr>
-      <w:r>
-        <w:rPr>
-          <w:b w:val="0"/>
-          <w:color w:val="4A4A49"/>
-          <w:sz w:val="22"/>
-        </w:rPr>
-        <w:t>Fuera de la lamina (habla de la practica): Convenciones de nombres del curso, y hay que exigirlas desde hoy porque el taller se corrige ejecutando el guion en el PostgreSQL que PostgreSQL en el navegador trae en el navegador.</w:t>
-      </w:r>
-    </w:p>
-    <w:p>
-      <w:r>
-        <w:rPr>
-          <w:b/>
-          <w:color w:val="4A4A49"/>
-          <w:sz w:val="22"/>
-        </w:rPr>
-        <w:t>[Slide 21] Herramientas del dia y que se puede demostrar con cada una</w:t>
-      </w:r>
-      <w:r>
-        <w:rPr>
-          <w:b w:val="0"/>
-          <w:color w:val="4A4A49"/>
-          <w:sz w:val="22"/>
-        </w:rPr>
-        <w:t xml:space="preserve"> — 3 vinetas.</w:t>
-      </w:r>
-    </w:p>
-    <w:p>
-      <w:pPr>
-        <w:pStyle w:val="ListBullet2"/>
-      </w:pPr>
-      <w:r>
-        <w:rPr>
-          <w:b w:val="0"/>
-          <w:color w:val="4A4A49"/>
-          <w:sz w:val="22"/>
-        </w:rPr>
-        <w:t>DESARROLLO (para explicarlo, no se proyecta):</w:t>
-      </w:r>
-    </w:p>
-    <w:p>
-      <w:pPr>
-        <w:pStyle w:val="ListBullet2"/>
-      </w:pPr>
-      <w:r>
-        <w:rPr>
-          <w:b w:val="0"/>
-          <w:color w:val="4A4A49"/>
-          <w:sz w:val="22"/>
-        </w:rPr>
-        <w:t>Tambien se demuestra el borrado en cascada: DELETE FROM factura WHERE id_factura = 1 y verificar con SELECT COUNT(*) FROM detalle_factura que las lineas hijas desaparecieron.</w:t>
-      </w:r>
-    </w:p>
-    <w:p>
-      <w:pPr>
-        <w:pStyle w:val="ListBullet2"/>
-      </w:pPr>
-      <w:r>
-        <w:rPr>
-          <w:b w:val="0"/>
-          <w:color w:val="4A4A49"/>
-          <w:sz w:val="22"/>
-        </w:rPr>
-        <w:t>DB Fiddle: es un PostgreSQL real en el navegador que ejecuta el DDL y muestra el error exacto si algo no compila.</w:t>
-      </w:r>
-    </w:p>
-    <w:p>
-      <w:pPr>
-        <w:pStyle w:val="ListBullet2"/>
-      </w:pPr>
-      <w:r>
-        <w:rPr>
-          <w:b w:val="0"/>
-          <w:color w:val="4A4A49"/>
-          <w:sz w:val="22"/>
-        </w:rPr>
-        <w:t>Un visor Mermaid: convierte el texto erDiagram en el diagrama, y ese texto es la fuente que se versiona junto al DDL.</w:t>
-      </w:r>
-    </w:p>
-    <w:p>
-      <w:pPr>
-        <w:pStyle w:val="ListBullet2"/>
-      </w:pPr>
-      <w:r>
-        <w:rPr>
-          <w:b w:val="0"/>
-          <w:color w:val="4A4A49"/>
-          <w:sz w:val="22"/>
-        </w:rPr>
-        <w:t>NOTAS:</w:t>
-      </w:r>
-    </w:p>
-    <w:p>
-      <w:pPr>
-        <w:pStyle w:val="ListBullet2"/>
-      </w:pPr>
-      <w:r>
-        <w:rPr>
-          <w:b w:val="0"/>
-          <w:color w:val="4A4A49"/>
-          <w:sz w:val="22"/>
-        </w:rPr>
-        <w:t>Sobre lo que se puede demostrar con herramientas gratuitas conviene ser preciso.</w:t>
-      </w:r>
-    </w:p>
-    <w:p>
-      <w:pPr>
-        <w:pStyle w:val="ListBullet2"/>
-      </w:pPr>
-      <w:r>
-        <w:rPr>
-          <w:b w:val="0"/>
-          <w:color w:val="4A4A49"/>
-          <w:sz w:val="22"/>
-        </w:rPr>
-        <w:t>En DB Fiddle, sin cuenta y en menos de un minuto, se ejecuta el guion completo de CREATE TABLE con claves primarias, foraneas y CHECK, se insertan Ana Perez, Luna y su cita, se corre el JOIN de las tres tablas y, sobre todo, se provoca el error de integridad en vivo insertando una cita con id_mascota inexistente para que el grupo lea el mensaje real del motor.</w:t>
-      </w:r>
-    </w:p>
-    <w:p>
-      <w:pPr>
-        <w:pStyle w:val="ListBullet2"/>
-      </w:pPr>
-      <w:r>
-        <w:rPr>
-          <w:b w:val="0"/>
-          <w:color w:val="4A4A49"/>
-          <w:sz w:val="22"/>
-        </w:rPr>
-        <w:t>Lo que DB Fiddle no da es persistencia: cada ejecucion recrea el esquema desde cero y no hay usuarios ni roles reales, razon por la cual la Clase 2 trabaja con matriz documentada.</w:t>
-      </w:r>
-    </w:p>
-    <w:p>
-      <w:pPr>
-        <w:pStyle w:val="ListBullet2"/>
-      </w:pPr>
-      <w:r>
-        <w:rPr>
-          <w:b w:val="0"/>
-          <w:color w:val="4A4A49"/>
-          <w:sz w:val="22"/>
-        </w:rPr>
-        <w:t>Oracle Live SQL exige cuenta gratuita pero conserva esquema y guiones entre sesiones y admite bloques PL/SQL, que es lo que se necesitara desde la Clase 3; conviene que el estudiante la cree hoy y no el dia que la necesite. draw.io corre en el navegador, no pide cuenta y exporta PNG, el formato que pide PostgreSQL en el navegador.</w:t>
-      </w:r>
-    </w:p>
-    <w:p>
-      <w:pPr>
-        <w:pStyle w:val="ListBullet2"/>
-      </w:pPr>
-      <w:r>
-        <w:rPr>
-          <w:b w:val="0"/>
-          <w:color w:val="4A4A49"/>
-          <w:sz w:val="22"/>
-        </w:rPr>
-        <w:t>De ahi sale la regla operativa del curso: la fuente de verdad es el archivo sql en la carpeta del proyecto, nunca la pestana del navegador, y el estudiante va bien si reconstruye el esquema completo en menos de cinco minutos pegando su propio guion. draw.io y Excalidraw: son pizarras para pensar el modelo a mano alzada, sin instalar nada.</w:t>
-      </w:r>
-    </w:p>
-    <w:p>
-      <w:pPr>
-        <w:pStyle w:val="ListBullet2"/>
-      </w:pPr>
-      <w:r>
-        <w:rPr>
-          <w:b w:val="0"/>
-          <w:color w:val="4A4A49"/>
-          <w:sz w:val="22"/>
-        </w:rPr>
-        <w:t>Fuera de la lamina (habla de la practica): Sobre lo que se puede demostrar con herramientas gratuitas conviene ser preciso, porque de eso depende que el taller no se atore.</w:t>
-      </w:r>
-    </w:p>
-    <w:p>
-      <w:r>
-        <w:rPr>
-          <w:b/>
-          <w:color w:val="4A4A49"/>
-          <w:sz w:val="22"/>
-        </w:rPr>
-        <w:t>[Slide 22] Del ER dibujado al codigo Mermaid</w:t>
-      </w:r>
-      <w:r>
-        <w:rPr>
-          <w:b w:val="0"/>
-          <w:color w:val="4A4A49"/>
-          <w:sz w:val="22"/>
-        </w:rPr>
-        <w:t xml:space="preserve"> — 3 vinetas.</w:t>
-      </w:r>
-    </w:p>
-    <w:p>
-      <w:pPr>
-        <w:pStyle w:val="ListBullet2"/>
-      </w:pPr>
-      <w:r>
-        <w:rPr>
-          <w:b w:val="0"/>
-          <w:color w:val="4A4A49"/>
-          <w:sz w:val="22"/>
-        </w:rPr>
-        <w:t>DESARROLLO (para explicarlo, no se proyecta):</w:t>
-      </w:r>
-    </w:p>
-    <w:p>
-      <w:pPr>
-        <w:pStyle w:val="ListBullet2"/>
-      </w:pPr>
-      <w:r>
-        <w:rPr>
-          <w:b w:val="0"/>
-          <w:color w:val="4A4A49"/>
-          <w:sz w:val="22"/>
-        </w:rPr>
-        <w:t>Un modelo ER en Mermaid NO es una imagen: es texto en sintaxis Mermaid (erDiagram) que un visor renderiza al instante.</w:t>
-      </w:r>
-    </w:p>
-    <w:p>
-      <w:pPr>
-        <w:pStyle w:val="ListBullet2"/>
-      </w:pPr>
-      <w:r>
-        <w:rPr>
-          <w:b w:val="0"/>
-          <w:color w:val="4A4A49"/>
-          <w:sz w:val="22"/>
-        </w:rPr>
-        <w:t>La IA acierta la sintaxis; el modelo sigue siendo del estudiante, y por eso hay que revisar lo que devuelve: entidades completas, cardinalidades en el sentido correcto, PK y FK marcadas.</w:t>
-      </w:r>
-    </w:p>
-    <w:p>
-      <w:pPr>
-        <w:pStyle w:val="ListBullet2"/>
-      </w:pPr>
-      <w:r>
-        <w:rPr>
-          <w:b w:val="0"/>
-          <w:color w:val="4A4A49"/>
-          <w:sz w:val="22"/>
-        </w:rPr>
-        <w:t>El paso que nadie se puede saltar es pegar el codigo en un visor Mermaid y mirarlo renderizado, porque un diagrama que no renderiza no comunica nada.</w:t>
-      </w:r>
-    </w:p>
-    <w:p>
-      <w:pPr>
-        <w:pStyle w:val="ListBullet2"/>
-      </w:pPr>
-      <w:r>
-        <w:rPr>
-          <w:b w:val="0"/>
-          <w:color w:val="4A4A49"/>
-          <w:sz w:val="22"/>
-        </w:rPr>
-        <w:t>NOTAS:</w:t>
-      </w:r>
-    </w:p>
-    <w:p>
-      <w:pPr>
-        <w:pStyle w:val="ListBullet2"/>
-      </w:pPr>
-      <w:r>
-        <w:rPr>
-          <w:b w:val="0"/>
-          <w:color w:val="4A4A49"/>
-          <w:sz w:val="22"/>
-        </w:rPr>
-        <w:t>Ultimo tramo.</w:t>
-      </w:r>
-    </w:p>
-    <w:p>
-      <w:pPr>
-        <w:pStyle w:val="ListBullet2"/>
-      </w:pPr>
-      <w:r>
-        <w:rPr>
-          <w:b w:val="0"/>
-          <w:color w:val="4A4A49"/>
-          <w:sz w:val="22"/>
-        </w:rPr>
-        <w:t>Eso no significa que haya que dibujar escribiendo codigo, y conviene decirlo asi para que nadie se bloquee: el camino corto es disenar visual en draw.io o Excalidraw, que es donde se piensa el modelo, y despues pedirle a una IA que traduzca ese boceto a Mermaid.</w:t>
-      </w:r>
-    </w:p>
-    <w:p>
-      <w:pPr>
-        <w:pStyle w:val="ListBullet2"/>
-      </w:pPr>
-      <w:r>
-        <w:rPr>
-          <w:b w:val="0"/>
-          <w:color w:val="4A4A49"/>
-          <w:sz w:val="22"/>
-        </w:rPr>
-        <w:t>El PNG exportado se conserva en la carpeta del proyecto para el informe, pero no reemplaza la respuesta en la plataforma.</w:t>
-      </w:r>
-    </w:p>
-    <w:p>
-      <w:pPr>
-        <w:pStyle w:val="ListBullet2"/>
-      </w:pPr>
-      <w:r>
-        <w:rPr>
-          <w:b w:val="0"/>
-          <w:color w:val="4A4A49"/>
-          <w:sz w:val="22"/>
-        </w:rPr>
-        <w:t>La demo debe terminar exactamente ahi, y deja los cuatro pasos proyectados mientras el grupo trabaja.</w:t>
-      </w:r>
-    </w:p>
-    <w:p>
-      <w:pPr>
-        <w:pStyle w:val="ListBullet2"/>
-      </w:pPr>
-      <w:r>
-        <w:rPr>
-          <w:b w:val="0"/>
-          <w:color w:val="4A4A49"/>
-          <w:sz w:val="22"/>
-        </w:rPr>
-        <w:t>PREGUNTAS FRECUENTES DEL GRUPO</w:t>
-      </w:r>
-    </w:p>
-    <w:p>
-      <w:pPr>
-        <w:pStyle w:val="ListBullet2"/>
-      </w:pPr>
-      <w:r>
-        <w:rPr>
-          <w:b w:val="0"/>
-          <w:color w:val="4A4A49"/>
-          <w:sz w:val="22"/>
-        </w:rPr>
-        <w:t>Primera: si la pantalla muestra todo junto, por que no una sola tabla con todo.</w:t>
-      </w:r>
-    </w:p>
-    <w:p>
-      <w:pPr>
-        <w:pStyle w:val="ListBullet2"/>
-      </w:pPr>
-      <w:r>
-        <w:rPr>
-          <w:b w:val="0"/>
-          <w:color w:val="4A4A49"/>
-          <w:sz w:val="22"/>
-        </w:rPr>
-        <w:t>Segunda: la clave primaria tiene que ser el primer campo y autoincremental.</w:t>
-      </w:r>
-    </w:p>
-    <w:p>
-      <w:pPr>
-        <w:pStyle w:val="ListBullet2"/>
-      </w:pPr>
-      <w:r>
-        <w:rPr>
-          <w:b w:val="0"/>
-          <w:color w:val="4A4A49"/>
-          <w:sz w:val="22"/>
-        </w:rPr>
-        <w:t>No: el orden fisico de las columnas es irrelevante para el motor, la clave primaria es una restriccion y no una posicion, y el autoincremento es solo una forma comoda de generar valores sustitutos.</w:t>
-      </w:r>
-    </w:p>
-    <w:p>
-      <w:pPr>
-        <w:pStyle w:val="ListBullet2"/>
-      </w:pPr>
-      <w:r>
-        <w:rPr>
-          <w:b w:val="0"/>
-          <w:color w:val="4A4A49"/>
-          <w:sz w:val="22"/>
-        </w:rPr>
-        <w:t>Tercera, la mas valiosa porque abre las clases siguientes: si pongo la clave foranea, ya no necesito validar en la aplicacion.</w:t>
-      </w:r>
-    </w:p>
-    <w:p>
-      <w:pPr>
-        <w:pStyle w:val="ListBullet2"/>
-      </w:pPr>
-      <w:r>
-        <w:rPr>
-          <w:b w:val="0"/>
-          <w:color w:val="4A4A49"/>
-          <w:sz w:val="22"/>
-        </w:rPr>
-        <w:t>La clave foranea garantiza que el identificador exista, no que la regla de negocio se cumpla; la mascota inactiva tiene un identificador valido y la clave foranea la acepta sin chistar.</w:t>
-      </w:r>
-    </w:p>
-    <w:p>
-      <w:pPr>
-        <w:pStyle w:val="ListBullet2"/>
-      </w:pPr>
-      <w:r>
-        <w:rPr>
-          <w:b w:val="0"/>
-          <w:color w:val="4A4A49"/>
-          <w:sz w:val="22"/>
-        </w:rPr>
-        <w:t>Tres preguntas aparecen casi siempre y conviene tener la respuesta lista.</w:t>
-      </w:r>
-    </w:p>
-    <w:p>
-      <w:pPr>
-        <w:pStyle w:val="ListBullet2"/>
-      </w:pPr>
-      <w:r>
-        <w:rPr>
-          <w:b w:val="0"/>
-          <w:color w:val="4A4A49"/>
-          <w:sz w:val="22"/>
-        </w:rPr>
-        <w:t>La respuesta no es doctrinal sino de costo: ahi el telefono de un dueno con veinte citas vive veinte veces y basta una actualizacion parcial para que el sistema mienta; ademas ese diseno impide registrar un dueno sin cita o un insumo sin venta.</w:t>
-      </w:r>
-    </w:p>
-    <w:p>
-      <w:pPr>
-        <w:pStyle w:val="ListBullet2"/>
-      </w:pPr>
-      <w:r>
-        <w:rPr>
-          <w:b w:val="0"/>
-          <w:color w:val="4A4A49"/>
-          <w:sz w:val="22"/>
-        </w:rPr>
-        <w:t>Esa regla necesita otra herramienta: un CHECK cuando mira solo columnas de la misma fila, un procedimiento almacenado cuando debe consultar otra tabla, que es el hito de la Clase 3, o un disparador cuando debe aplicarse aunque nadie llame al procedimiento, que es el hito de la Clase 4.</w:t>
-      </w:r>
-    </w:p>
-    <w:p>
-      <w:pPr>
-        <w:pStyle w:val="ListBullet2"/>
-      </w:pPr>
-      <w:r>
-        <w:rPr>
-          <w:b w:val="0"/>
-          <w:color w:val="4A4A49"/>
-          <w:sz w:val="22"/>
-        </w:rPr>
-        <w:t>Fuera de la lamina (habla de la practica): Ultimo tramo, y es el que decide si el taller se entrega o no: como pasa el estudiante del dibujo a lo que la plataforma califica.</w:t>
-      </w:r>
-    </w:p>
-    <w:p>
-      <w:r>
-        <w:rPr>
-          <w:b/>
-          <w:color w:val="4A4A49"/>
-          <w:sz w:val="22"/>
-        </w:rPr>
-        <w:t>Demo que usted debe poder repetir:</w:t>
-      </w:r>
-      <w:r>
-        <w:rPr>
-          <w:b w:val="0"/>
-          <w:color w:val="4A4A49"/>
-          <w:sz w:val="22"/>
-        </w:rPr>
-        <w:t xml:space="preserve"> Boceto ER en draw.io (Dueno-Mascota-Cita) + CREATE TABLE minimo en DB Fiddle, y cierre pasando el boceto a Mermaid con IA para pegarlo renderizado en ExamLab.</w:t>
+        <w:t>notas del presentador</w:t>
+      </w:r>
+      <w:r>
+        <w:rPr>
+          <w:b w:val="0"/>
+          <w:color w:val="4A4A49"/>
+          <w:sz w:val="22"/>
+        </w:rPr>
+        <w:t xml:space="preserve"> de cada lámina: qué decir al entrar y en cada clic, el ejemplo, las preguntas típicas y el puente a la siguiente.</w:t>
       </w:r>
     </w:p>
     <w:p>
@@ -2465,6 +329,2685 @@
           <w:color w:val="1A1C1D"/>
           <w:sz w:val="32"/>
         </w:rPr>
+        <w:t>[Slide 2] Encuadre de hoy · Tema y objetivo</w:t>
+      </w:r>
+    </w:p>
+    <w:p>
+      <w:r>
+        <w:rPr>
+          <w:b w:val="0"/>
+          <w:color w:val="4A4A49"/>
+          <w:sz w:val="22"/>
+        </w:rPr>
+        <w:t>QUÉ ES (dilo así): Hoy no se repite Bases de Datos I: se arranca la base de datos de una clínica veterinaria que hoy trabaja en papel. Vamos a decidir qué tablas tiene, cómo se identifica cada fila y qué reglas defiende el motor por sí solo, y a dejar el modelo en dos formas que deben coincidir: el diagrama y el CREATE TABLE.</w:t>
+      </w:r>
+    </w:p>
+    <w:p>
+      <w:r>
+        <w:rPr>
+          <w:b w:val="0"/>
+          <w:color w:val="4A4A49"/>
+          <w:sz w:val="22"/>
+        </w:rPr>
+        <w:t>CÓMO DARLA (≈4 min):</w:t>
+      </w:r>
+    </w:p>
+    <w:p>
+      <w:pPr>
+        <w:pStyle w:val="ListBullet"/>
+      </w:pPr>
+      <w:r>
+        <w:rPr>
+          <w:b w:val="0"/>
+          <w:color w:val="4A4A49"/>
+          <w:sz w:val="22"/>
+        </w:rPr>
+        <w:t>Al entrar: Lee el tema y la herramienta. Pregunta de arranque: «¿qué pasa en una clínica cuando se pierde la ficha de un paciente?». Deja que respondan 1-2 personas.</w:t>
+      </w:r>
+    </w:p>
+    <w:p>
+      <w:pPr>
+        <w:pStyle w:val="ListBullet"/>
+      </w:pPr>
+      <w:r>
+        <w:rPr>
+          <w:b w:val="0"/>
+          <w:color w:val="4A4A49"/>
+          <w:sz w:val="22"/>
+        </w:rPr>
+        <w:t>Cierre del encuadre: «Al final de hoy van a poder decir por qué una cita no puede apuntar a una mascota que no existe, y por qué eso todavía no basta».</w:t>
+      </w:r>
+    </w:p>
+    <w:p>
+      <w:r>
+        <w:rPr>
+          <w:b w:val="0"/>
+          <w:color w:val="4A4A49"/>
+          <w:sz w:val="22"/>
+        </w:rPr>
+        <w:t>CUIDADO: Las herramientas son gratuitas y corren en el navegador: nadie tiene que instalar nada hoy. Si alguien no tiene cuenta en ningún lado, DB Fiddle funciona sin registrarse.</w:t>
+      </w:r>
+    </w:p>
+    <w:p>
+      <w:r>
+        <w:rPr>
+          <w:b w:val="0"/>
+          <w:color w:val="4A4A49"/>
+          <w:sz w:val="22"/>
+        </w:rPr>
+        <w:t>PASA A LA SIGUIENTE: Este es el recorrido de las dos horas.</w:t>
+      </w:r>
+    </w:p>
+    <w:p>
+      <w:pPr>
+        <w:spacing w:before="200" w:after="60"/>
+      </w:pPr>
+      <w:r>
+        <w:rPr>
+          <w:b/>
+          <w:color w:val="1A1C1D"/>
+          <w:sz w:val="32"/>
+        </w:rPr>
+        <w:t>[Slide 3] Mapa del bloque de hoy (120 min)</w:t>
+      </w:r>
+    </w:p>
+    <w:p>
+      <w:r>
+        <w:rPr>
+          <w:b w:val="0"/>
+          <w:color w:val="4A4A49"/>
+          <w:sz w:val="22"/>
+        </w:rPr>
+        <w:t>QUÉ ES (dilo así): Las dos horas en cinco tramos: encuadre, teoría con una lámina por concepto, demo en vivo, práctica opcional y cierre.</w:t>
+      </w:r>
+    </w:p>
+    <w:p>
+      <w:r>
+        <w:rPr>
+          <w:b w:val="0"/>
+          <w:color w:val="4A4A49"/>
+          <w:sz w:val="22"/>
+        </w:rPr>
+        <w:t>CÓMO DARLA (≈1 min):</w:t>
+      </w:r>
+    </w:p>
+    <w:p>
+      <w:pPr>
+        <w:pStyle w:val="ListBullet"/>
+      </w:pPr>
+      <w:r>
+        <w:rPr>
+          <w:b w:val="0"/>
+          <w:color w:val="4A4A49"/>
+          <w:sz w:val="22"/>
+        </w:rPr>
+        <w:t>Al entrar: Señala solo los tramos; no te detengas. La práctica tiene su guía en la carpeta de la clase y es opcional.</w:t>
+      </w:r>
+    </w:p>
+    <w:p>
+      <w:r>
+        <w:rPr>
+          <w:b w:val="0"/>
+          <w:color w:val="4A4A49"/>
+          <w:sz w:val="22"/>
+        </w:rPr>
+        <w:t>PASA A LA SIGUIENTE: Antes de dibujar una tabla, conozcamos para quién la dibujamos.</w:t>
+      </w:r>
+    </w:p>
+    <w:p>
+      <w:pPr>
+        <w:spacing w:before="200" w:after="60"/>
+      </w:pPr>
+      <w:r>
+        <w:rPr>
+          <w:b/>
+          <w:color w:val="1A1C1D"/>
+          <w:sz w:val="32"/>
+        </w:rPr>
+        <w:t>[Slide 4] El cliente: una clínica veterinaria en papel</w:t>
+      </w:r>
+    </w:p>
+    <w:p>
+      <w:r>
+        <w:rPr>
+          <w:b w:val="0"/>
+          <w:color w:val="4A4A49"/>
+          <w:sz w:val="22"/>
+        </w:rPr>
+        <w:t>QUÉ ES (dilo así): Toda base de datos se diseña para alguien. Nuestro cliente es una clínica veterinaria de Cali con unas 150 citas diarias, 16 veterinarios y cerca de 5.000 mascotas de 2.000 dueños, y todo vive en carpetas. El semestre entero construye la capa de datos de esa clínica: no la aplicación ni las pantallas, sino el esquema, sus reglas, sus permisos y su rendimiento.</w:t>
+      </w:r>
+    </w:p>
+    <w:p>
+      <w:r>
+        <w:rPr>
+          <w:b w:val="0"/>
+          <w:color w:val="4A4A49"/>
+          <w:sz w:val="22"/>
+        </w:rPr>
+        <w:t>CÓMO DARLA (≈4 min):</w:t>
+      </w:r>
+    </w:p>
+    <w:p>
+      <w:pPr>
+        <w:pStyle w:val="ListBullet"/>
+      </w:pPr>
+      <w:r>
+        <w:rPr>
+          <w:b w:val="0"/>
+          <w:color w:val="4A4A49"/>
+          <w:sz w:val="22"/>
+        </w:rPr>
+        <w:t>Al entrar: Arriba, los tres dolores, y conecta cada uno con una decisión del curso: la ficha perdida se resuelve con una fila que tiene clave primaria (hoy); las filas en la sala de espera, con índices (Clase 7); la falta de métricas, con consultas agregadas (Clase 6). Abajo, las tres personas y lo que quiere cada una, y el recuadro del conflicto: «un campo más en el formulario de la cita le da métricas al dueño y le suma clics a la recepcionista».</w:t>
+      </w:r>
+    </w:p>
+    <w:p>
+      <w:r>
+        <w:rPr>
+          <w:b w:val="0"/>
+          <w:color w:val="4A4A49"/>
+          <w:sz w:val="22"/>
+        </w:rPr>
+        <w:t>EJEMPLO: ¿Guardamos la raza de la mascota? Al dueño le sirve para saber qué razas atiende más; a la recepcionista le cuesta un campo más por cita; al veterinario le sirve en la consulta. Se guarda en mascota, una sola vez, y no en cada cita.</w:t>
+      </w:r>
+    </w:p>
+    <w:p>
+      <w:r>
+        <w:rPr>
+          <w:b w:val="0"/>
+          <w:color w:val="4A4A49"/>
+          <w:sz w:val="22"/>
+        </w:rPr>
+        <w:t>SI PREGUNTAN:</w:t>
+      </w:r>
+    </w:p>
+    <w:p>
+      <w:pPr>
+        <w:pStyle w:val="ListBullet"/>
+      </w:pPr>
+      <w:r>
+        <w:rPr>
+          <w:b w:val="0"/>
+          <w:color w:val="4A4A49"/>
+          <w:sz w:val="22"/>
+        </w:rPr>
+        <w:t>«¿Esta columna sobra?» → Responde con otra pregunta: ¿cuál de las tres personas la necesita, y qué pierde otra si la agregamos? Así se decide un modelo, no se copia.</w:t>
+      </w:r>
+    </w:p>
+    <w:p>
+      <w:pPr>
+        <w:pStyle w:val="ListBullet"/>
+      </w:pPr>
+      <w:r>
+        <w:rPr>
+          <w:b w:val="0"/>
+          <w:color w:val="4A4A49"/>
+          <w:sz w:val="22"/>
+        </w:rPr>
+        <w:t>«¿Tenemos que hacer la aplicación?» → No. En esta materia se construye la base de datos: tablas, reglas, roles, procedimientos y rendimiento. La aplicación es de otra materia.</w:t>
+      </w:r>
+    </w:p>
+    <w:p>
+      <w:r>
+        <w:rPr>
+          <w:b w:val="0"/>
+          <w:color w:val="4A4A49"/>
+          <w:sz w:val="22"/>
+        </w:rPr>
+        <w:t>CUIDADO: El modelo tiene 8 entidades (dueño, mascota, veterinario, cita, consulta, insumo, factura, detalle de factura) y 3 reglas que vuelven todo el semestre: una mascota inactiva no agenda, el stock nunca queda negativo y todo cambio de estado de una cita queda registrado. Nómbralas hoy aunque se resuelvan después.</w:t>
+      </w:r>
+    </w:p>
+    <w:p>
+      <w:r>
+        <w:rPr>
+          <w:b w:val="0"/>
+          <w:color w:val="4A4A49"/>
+          <w:sz w:val="22"/>
+        </w:rPr>
+        <w:t>PASA A LA SIGUIENTE: ¿Por qué esto no es repetir Bases de Datos I? Por el vocabulario con que vamos a decidir.</w:t>
+      </w:r>
+    </w:p>
+    <w:p>
+      <w:pPr>
+        <w:spacing w:before="200" w:after="60"/>
+      </w:pPr>
+      <w:r>
+        <w:rPr>
+          <w:b/>
+          <w:color w:val="1A1C1D"/>
+          <w:sz w:val="32"/>
+        </w:rPr>
+        <w:t>[Slide 5] Por que esto no es Bases de Datos I, y el vocabulario minimo</w:t>
+      </w:r>
+    </w:p>
+    <w:p>
+      <w:r>
+        <w:rPr>
+          <w:b w:val="0"/>
+          <w:color w:val="4A4A49"/>
+          <w:sz w:val="22"/>
+        </w:rPr>
+        <w:t>QUÉ ES (dilo así): En Bases de Datos I el objetivo era escribir la consulta que devuelve el resultado correcto. Aquí el objetivo es diseñar un esquema que siga siendo correcto cuando lo usen tres personas distintas, cuando tenga cien mil filas y cuando alguien meta datos malos. Para decidir eso hacen falta tres palabras precisas: tabla, fila y columna con su dominio.</w:t>
+      </w:r>
+    </w:p>
+    <w:p>
+      <w:r>
+        <w:rPr>
+          <w:b w:val="0"/>
+          <w:color w:val="4A4A49"/>
+          <w:sz w:val="22"/>
+        </w:rPr>
+        <w:t>CÓMO DARLA (≈3 min):</w:t>
+      </w:r>
+    </w:p>
+    <w:p>
+      <w:pPr>
+        <w:pStyle w:val="ListBullet"/>
+      </w:pPr>
+      <w:r>
+        <w:rPr>
+          <w:b w:val="0"/>
+          <w:color w:val="4A4A49"/>
+          <w:sz w:val="22"/>
+        </w:rPr>
+        <w:t>Al entrar: La tabla mascota con tres filas: «una tabla guarda cosas de un solo tipo; aquí no hay dueños ni citas, solo mascotas».</w:t>
+      </w:r>
+    </w:p>
+    <w:p>
+      <w:pPr>
+        <w:pStyle w:val="ListBullet"/>
+      </w:pPr>
+      <w:r>
+        <w:rPr>
+          <w:b w:val="0"/>
+          <w:color w:val="4A4A49"/>
+          <w:sz w:val="22"/>
+        </w:rPr>
+        <w:t>Clic 1: Se marca la fila de Luna: «una fila es UNA mascota concreta; si la misma mascota apareciera en dos filas, ya no sabríamos cuál es la verdadera».</w:t>
+      </w:r>
+    </w:p>
+    <w:p>
+      <w:pPr>
+        <w:pStyle w:val="ListBullet"/>
+      </w:pPr>
+      <w:r>
+        <w:rPr>
+          <w:b w:val="0"/>
+          <w:color w:val="4A4A49"/>
+          <w:sz w:val="22"/>
+        </w:rPr>
+        <w:t>Clic 2: Se marca la columna especie y aparece su dominio: «una columna no acepta cualquier cosa; especie solo admite cuatro valores, y eso lo puede vigilar el motor».</w:t>
+      </w:r>
+    </w:p>
+    <w:p>
+      <w:r>
+        <w:rPr>
+          <w:b w:val="0"/>
+          <w:color w:val="4A4A49"/>
+          <w:sz w:val="22"/>
+        </w:rPr>
+        <w:t>EJEMPLO: Si alguien escribe especie = 'Perro' en vez de 'Canino', el dato parece correcto pero rompe el conteo de especies del mes. El dominio cerrado es lo que evita eso.</w:t>
+      </w:r>
+    </w:p>
+    <w:p>
+      <w:r>
+        <w:rPr>
+          <w:b w:val="0"/>
+          <w:color w:val="4A4A49"/>
+          <w:sz w:val="22"/>
+        </w:rPr>
+        <w:t>SI PREGUNTAN:</w:t>
+      </w:r>
+    </w:p>
+    <w:p>
+      <w:pPr>
+        <w:pStyle w:val="ListBullet"/>
+      </w:pPr>
+      <w:r>
+        <w:rPr>
+          <w:b w:val="0"/>
+          <w:color w:val="4A4A49"/>
+          <w:sz w:val="22"/>
+        </w:rPr>
+        <w:t>«¿Dominio no era el tema del proyecto?» → La palabra tiene dos usos: el dominio de un atributo (sus valores legales) y el dominio del problema (la clínica). Hoy se usan los dos; aclara cuál.</w:t>
+      </w:r>
+    </w:p>
+    <w:p>
+      <w:r>
+        <w:rPr>
+          <w:b w:val="0"/>
+          <w:color w:val="4A4A49"/>
+          <w:sz w:val="22"/>
+        </w:rPr>
+        <w:t>CUIDADO: Sobre estas tres nociones se monta el semestre: los permisos de la Clase 2 se dan sobre tablas, las validaciones de la Clase 3 miran columnas y los índices de la Clase 7 se crean sobre columnas concretas.</w:t>
+      </w:r>
+    </w:p>
+    <w:p>
+      <w:r>
+        <w:rPr>
+          <w:b w:val="0"/>
+          <w:color w:val="4A4A49"/>
+          <w:sz w:val="22"/>
+        </w:rPr>
+        <w:t>PASA A LA SIGUIENTE: El mismo modelo se puede mirar de dos maneras: como negocio y como tablas.</w:t>
+      </w:r>
+    </w:p>
+    <w:p>
+      <w:pPr>
+        <w:spacing w:before="200" w:after="60"/>
+      </w:pPr>
+      <w:r>
+        <w:rPr>
+          <w:b/>
+          <w:color w:val="1A1C1D"/>
+          <w:sz w:val="32"/>
+        </w:rPr>
+        <w:t>[Slide 6] Nivel conceptual y nivel fisico: dos vistas del mismo modelo</w:t>
+      </w:r>
+    </w:p>
+    <w:p>
+      <w:r>
+        <w:rPr>
+          <w:b w:val="0"/>
+          <w:color w:val="4A4A49"/>
+          <w:sz w:val="22"/>
+        </w:rPr>
+        <w:t>QUÉ ES (dilo así): Hay dos niveles que se mezclan. El conceptual nombra entidades y relaciones con palabras del negocio, sin decir nada del motor. El físico convierte eso en tablas con columnas tipadas, restricciones y claves. No son dos modelos: es el mismo modelo visto de dos formas, y por eso hoy se producen dos artefactos que deben coincidir.</w:t>
+      </w:r>
+    </w:p>
+    <w:p>
+      <w:r>
+        <w:rPr>
+          <w:b w:val="0"/>
+          <w:color w:val="4A4A49"/>
+          <w:sz w:val="22"/>
+        </w:rPr>
+        <w:t>CÓMO DARLA (≈3 min):</w:t>
+      </w:r>
+    </w:p>
+    <w:p>
+      <w:pPr>
+        <w:pStyle w:val="ListBullet"/>
+      </w:pPr>
+      <w:r>
+        <w:rPr>
+          <w:b w:val="0"/>
+          <w:color w:val="4A4A49"/>
+          <w:sz w:val="22"/>
+        </w:rPr>
+        <w:t>Al entrar: Arriba, el nivel conceptual: dos cajas, dueño y mascota, y el verbo «posee». «Esto lo entiende la administradora de la clínica; no hay un solo tipo de dato».</w:t>
+      </w:r>
+    </w:p>
+    <w:p>
+      <w:pPr>
+        <w:pStyle w:val="ListBullet"/>
+      </w:pPr>
+      <w:r>
+        <w:rPr>
+          <w:b w:val="0"/>
+          <w:color w:val="4A4A49"/>
+          <w:sz w:val="22"/>
+        </w:rPr>
+        <w:t>Clic 1: Abajo aparecen las tablas dueno y mascota con sus columnas: id_dueno SERIAL PK, telefono VARCHAR(30) NOT NULL, id_dueno INT FK → dueno. «Esto ya lo entiende el motor».</w:t>
+      </w:r>
+    </w:p>
+    <w:p>
+      <w:pPr>
+        <w:pStyle w:val="ListBullet"/>
+      </w:pPr>
+      <w:r>
+        <w:rPr>
+          <w:b w:val="0"/>
+          <w:color w:val="4A4A49"/>
+          <w:sz w:val="22"/>
+        </w:rPr>
+        <w:t>Clic 2: Las flechas punteadas unen cada caja con su tabla: «dos vistas del MISMO modelo; el diagrama ER es la vista conceptual y el CREATE TABLE la física».</w:t>
+      </w:r>
+    </w:p>
+    <w:p>
+      <w:r>
+        <w:rPr>
+          <w:b w:val="0"/>
+          <w:color w:val="4A4A49"/>
+          <w:sz w:val="22"/>
+        </w:rPr>
+        <w:t>EJEMPLO: «Dueño posee mascota» en el diagrama se convierte en la columna mascota.id_dueno con REFERENCES dueno(id_dueno) en el DDL.</w:t>
+      </w:r>
+    </w:p>
+    <w:p>
+      <w:r>
+        <w:rPr>
+          <w:b w:val="0"/>
+          <w:color w:val="4A4A49"/>
+          <w:sz w:val="22"/>
+        </w:rPr>
+        <w:t>SI PREGUNTAN:</w:t>
+      </w:r>
+    </w:p>
+    <w:p>
+      <w:pPr>
+        <w:pStyle w:val="ListBullet"/>
+      </w:pPr>
+      <w:r>
+        <w:rPr>
+          <w:b w:val="0"/>
+          <w:color w:val="4A4A49"/>
+          <w:sz w:val="22"/>
+        </w:rPr>
+        <w:t>«¿Por qué el diagrama debe llevar tipos y longitudes si es conceptual?» → Porque el criterio de completitud es que alguien pueda escribir el CREATE TABLE mirándolo sin preguntar. Sin tipos, el diagrama no se puede traducir.</w:t>
+      </w:r>
+    </w:p>
+    <w:p>
+      <w:r>
+        <w:rPr>
+          <w:b w:val="0"/>
+          <w:color w:val="4A4A49"/>
+          <w:sz w:val="22"/>
+        </w:rPr>
+        <w:t>CUIDADO: No presentes el diagrama y el DDL como dos tareas separadas: si un nombre cambia entre los dos, ya no son el mismo modelo.</w:t>
+      </w:r>
+    </w:p>
+    <w:p>
+      <w:r>
+        <w:rPr>
+          <w:b w:val="0"/>
+          <w:color w:val="4A4A49"/>
+          <w:sz w:val="22"/>
+        </w:rPr>
+        <w:t>PASA A LA SIGUIENTE: Veamos el modelo mínimo de la clínica en su vista conceptual.</w:t>
+      </w:r>
+    </w:p>
+    <w:p>
+      <w:pPr>
+        <w:spacing w:before="200" w:after="60"/>
+      </w:pPr>
+      <w:r>
+        <w:rPr>
+          <w:b/>
+          <w:color w:val="1A1C1D"/>
+          <w:sz w:val="32"/>
+        </w:rPr>
+        <w:t>[Slide 7] ER minimo de la clinica (con cardinalidad)</w:t>
+      </w:r>
+    </w:p>
+    <w:p>
+      <w:r>
+        <w:rPr>
+          <w:b w:val="0"/>
+          <w:color w:val="4A4A49"/>
+          <w:sz w:val="22"/>
+        </w:rPr>
+        <w:t>QUÉ ES (dilo así): Este es el corazón del modelo: dueño, mascota, cita y veterinario, unidos por tres relaciones uno a muchos. La regla que se lee aquí es que la clave foránea vive siempre en la tabla del lado «muchos».</w:t>
+      </w:r>
+    </w:p>
+    <w:p>
+      <w:r>
+        <w:rPr>
+          <w:b w:val="0"/>
+          <w:color w:val="4A4A49"/>
+          <w:sz w:val="22"/>
+        </w:rPr>
+        <w:t>CÓMO DARLA (≈2 min):</w:t>
+      </w:r>
+    </w:p>
+    <w:p>
+      <w:pPr>
+        <w:pStyle w:val="ListBullet"/>
+      </w:pPr>
+      <w:r>
+        <w:rPr>
+          <w:b w:val="0"/>
+          <w:color w:val="4A4A49"/>
+          <w:sz w:val="22"/>
+        </w:rPr>
+        <w:t>Al entrar: Lee las relaciones en voz alta: un dueño tiene N mascotas, una mascota tiene N citas, un veterinario atiende N citas. Señala dónde quedó cada FK: mascota lleva id_dueno y cita lleva id_mascota (y también id_veterinario, que el diagrama abrevia).</w:t>
+      </w:r>
+    </w:p>
+    <w:p>
+      <w:pPr>
+        <w:pStyle w:val="ListBullet"/>
+      </w:pPr>
+      <w:r>
+        <w:rPr>
+          <w:b w:val="0"/>
+          <w:color w:val="4A4A49"/>
+          <w:sz w:val="22"/>
+        </w:rPr>
+        <w:t>Después: Lee la nota de abajo: la PK identifica cada fila y la FK materializa la relación; el motor rechaza una cita con id_mascota 999 si esa mascota no existe.</w:t>
+      </w:r>
+    </w:p>
+    <w:p>
+      <w:r>
+        <w:rPr>
+          <w:b w:val="0"/>
+          <w:color w:val="4A4A49"/>
+          <w:sz w:val="22"/>
+        </w:rPr>
+        <w:t>EJEMPLO: Luna (id_mascota 10) pertenece a Ana Pérez (id_dueno 1): la fila de Luna guarda id_dueno = 1. Ana no guarda nada de Luna.</w:t>
+      </w:r>
+    </w:p>
+    <w:p>
+      <w:r>
+        <w:rPr>
+          <w:b w:val="0"/>
+          <w:color w:val="4A4A49"/>
+          <w:sz w:val="22"/>
+        </w:rPr>
+        <w:t>SI PREGUNTAN:</w:t>
+      </w:r>
+    </w:p>
+    <w:p>
+      <w:pPr>
+        <w:pStyle w:val="ListBullet"/>
+      </w:pPr>
+      <w:r>
+        <w:rPr>
+          <w:b w:val="0"/>
+          <w:color w:val="4A4A49"/>
+          <w:sz w:val="22"/>
+        </w:rPr>
+        <w:t>«¿Por qué la FK no va en dueño, con la lista de sus mascotas?» → Porque una celda no guarda listas (primera forma normal) y porque un dueño puede tener cualquier número de mascotas. El lado N es el que tiene una sola referencia por fila.</w:t>
+      </w:r>
+    </w:p>
+    <w:p>
+      <w:r>
+        <w:rPr>
+          <w:b w:val="0"/>
+          <w:color w:val="4A4A49"/>
+          <w:sz w:val="22"/>
+        </w:rPr>
+        <w:t>PASA A LA SIGUIENTE: Ese diagrama, escrito como DDL: la tabla que depende de cita.</w:t>
+      </w:r>
+    </w:p>
+    <w:p>
+      <w:pPr>
+        <w:spacing w:before="200" w:after="60"/>
+      </w:pPr>
+      <w:r>
+        <w:rPr>
+          <w:b/>
+          <w:color w:val="1A1C1D"/>
+          <w:sz w:val="32"/>
+        </w:rPr>
+        <w:t>[Slide 8] El DDL minimo que sostiene el ER</w:t>
+      </w:r>
+    </w:p>
+    <w:p>
+      <w:r>
+        <w:rPr>
+          <w:b w:val="0"/>
+          <w:color w:val="4A4A49"/>
+          <w:sz w:val="22"/>
+        </w:rPr>
+        <w:t>QUÉ ES (dilo así): La misma información del diagrama, ahora en físico, sobre la tabla consulta. Muestra las tres piezas que toda tabla del curso tiene: clave primaria, clave foránea y una regla de negocio con CHECK.</w:t>
+      </w:r>
+    </w:p>
+    <w:p>
+      <w:r>
+        <w:rPr>
+          <w:b w:val="0"/>
+          <w:color w:val="4A4A49"/>
+          <w:sz w:val="22"/>
+        </w:rPr>
+        <w:t>CÓMO DARLA (≈3 min):</w:t>
+      </w:r>
+    </w:p>
+    <w:p>
+      <w:pPr>
+        <w:pStyle w:val="ListBullet"/>
+      </w:pPr>
+      <w:r>
+        <w:rPr>
+          <w:b w:val="0"/>
+          <w:color w:val="4A4A49"/>
+          <w:sz w:val="22"/>
+        </w:rPr>
+        <w:t>Línea 2: id_consulta SERIAL PRIMARY KEY: la base genera el número y ninguna consulta se repite.</w:t>
+      </w:r>
+    </w:p>
+    <w:p>
+      <w:pPr>
+        <w:pStyle w:val="ListBullet"/>
+      </w:pPr>
+      <w:r>
+        <w:rPr>
+          <w:b w:val="0"/>
+          <w:color w:val="4A4A49"/>
+          <w:sz w:val="22"/>
+        </w:rPr>
+        <w:t>Líneas 3-4: id_cita INT NOT NULL UNIQUE REFERENCES cita: NOT NULL porque no hay consulta sin cita, REFERENCES porque la cita debe existir, y UNIQUE porque una cita tiene a lo sumo una consulta. Eso convierte la relación en 1:1.</w:t>
+      </w:r>
+    </w:p>
+    <w:p>
+      <w:pPr>
+        <w:pStyle w:val="ListBullet"/>
+      </w:pPr>
+      <w:r>
+        <w:rPr>
+          <w:b w:val="0"/>
+          <w:color w:val="4A4A49"/>
+          <w:sz w:val="22"/>
+        </w:rPr>
+        <w:t>Líneas 5-7: diagnostico obligatorio y precio NUMERIC(12,2) con CHECK (precio &gt;= 0): la primera regla de negocio que defiende el motor.</w:t>
+      </w:r>
+    </w:p>
+    <w:p>
+      <w:r>
+        <w:rPr>
+          <w:b w:val="0"/>
+          <w:color w:val="4A4A49"/>
+          <w:sz w:val="22"/>
+        </w:rPr>
+        <w:t>EJEMPLO: Una segunda consulta para la cita 2 falla con «duplicate key value violates unique constraint "consulta_id_cita_key"», y un precio de −5 con «violates check constraint "consulta_precio_check"».</w:t>
+      </w:r>
+    </w:p>
+    <w:p>
+      <w:r>
+        <w:rPr>
+          <w:b w:val="0"/>
+          <w:color w:val="4A4A49"/>
+          <w:sz w:val="22"/>
+        </w:rPr>
+        <w:t>SI PREGUNTAN:</w:t>
+      </w:r>
+    </w:p>
+    <w:p>
+      <w:pPr>
+        <w:pStyle w:val="ListBullet"/>
+      </w:pPr>
+      <w:r>
+        <w:rPr>
+          <w:b w:val="0"/>
+          <w:color w:val="4A4A49"/>
+          <w:sz w:val="22"/>
+        </w:rPr>
+        <w:t>«¿Por qué no pongo id_consulta dentro de cita?» → Porque una cita programada todavía no tiene consulta: la columna quedaría vacía en la mayoría de filas. La FK va en la tabla que depende.</w:t>
+      </w:r>
+    </w:p>
+    <w:p>
+      <w:r>
+        <w:rPr>
+          <w:b w:val="0"/>
+          <w:color w:val="4A4A49"/>
+          <w:sz w:val="22"/>
+        </w:rPr>
+        <w:t>CUIDADO: La relación cita-consulta es 1:1 pero no simétrica: la cita existe sin consulta; la consulta no existe sin cita.</w:t>
+      </w:r>
+    </w:p>
+    <w:p>
+      <w:r>
+        <w:rPr>
+          <w:b w:val="0"/>
+          <w:color w:val="4A4A49"/>
+          <w:sz w:val="22"/>
+        </w:rPr>
+        <w:t>PASA A LA SIGUIENTE: El mismo patrón, completo, sobre la tabla de veterinarios.</w:t>
+      </w:r>
+    </w:p>
+    <w:p>
+      <w:pPr>
+        <w:spacing w:before="200" w:after="60"/>
+      </w:pPr>
+      <w:r>
+        <w:rPr>
+          <w:b/>
+          <w:color w:val="1A1C1D"/>
+          <w:sz w:val="32"/>
+        </w:rPr>
+        <w:t>[Slide 9] El patron de tabla: PK, obligatorios y dominio cerrado</w:t>
+      </w:r>
+    </w:p>
+    <w:p>
+      <w:r>
+        <w:rPr>
+          <w:b w:val="0"/>
+          <w:color w:val="4A4A49"/>
+          <w:sz w:val="22"/>
+        </w:rPr>
+        <w:t>QUÉ ES (dilo así): Este es el molde de cualquier tabla del curso, aplicado a veterinario: clave sustituta, dato natural con UNIQUE, columnas obligatorias, un dominio cerrado con CHECK y la baja lógica con DEFAULT.</w:t>
+      </w:r>
+    </w:p>
+    <w:p>
+      <w:r>
+        <w:rPr>
+          <w:b w:val="0"/>
+          <w:color w:val="4A4A49"/>
+          <w:sz w:val="22"/>
+        </w:rPr>
+        <w:t>CÓMO DARLA (≈2 min):</w:t>
+      </w:r>
+    </w:p>
+    <w:p>
+      <w:pPr>
+        <w:pStyle w:val="ListBullet"/>
+      </w:pPr>
+      <w:r>
+        <w:rPr>
+          <w:b w:val="0"/>
+          <w:color w:val="4A4A49"/>
+          <w:sz w:val="22"/>
+        </w:rPr>
+        <w:t>Líneas 3-4: id_veterinario SERIAL es la clave sustituta; tarjeta_prof es la natural: UNIQUE para que no se repita, pero puede faltar.</w:t>
+      </w:r>
+    </w:p>
+    <w:p>
+      <w:pPr>
+        <w:pStyle w:val="ListBullet"/>
+      </w:pPr>
+      <w:r>
+        <w:rPr>
+          <w:b w:val="0"/>
+          <w:color w:val="4A4A49"/>
+          <w:sz w:val="22"/>
+        </w:rPr>
+        <w:t>Líneas 5-7: nombre y especialidad son NOT NULL; especialidad solo acepta 'GENERAL', 'CIRUGIA' o 'DERMATOLOGIA'.</w:t>
+      </w:r>
+    </w:p>
+    <w:p>
+      <w:pPr>
+        <w:pStyle w:val="ListBullet"/>
+      </w:pPr>
+      <w:r>
+        <w:rPr>
+          <w:b w:val="0"/>
+          <w:color w:val="4A4A49"/>
+          <w:sz w:val="22"/>
+        </w:rPr>
+        <w:t>Líneas 8-9: activo CHAR(1) DEFAULT 'S' con CHECK: si no se dice nada, el veterinario nace activo, y nunca se borra: se marca 'N'.</w:t>
+      </w:r>
+    </w:p>
+    <w:p>
+      <w:r>
+        <w:rPr>
+          <w:b w:val="0"/>
+          <w:color w:val="4A4A49"/>
+          <w:sz w:val="22"/>
+        </w:rPr>
+        <w:t>EJEMPLO: INSERT INTO veterinario (nombre, especialidad) VALUES ('Laura Restrepo', 'GENERAL'); crea el id 1, con activo = 'S' y tarjeta_prof nula.</w:t>
+      </w:r>
+    </w:p>
+    <w:p>
+      <w:r>
+        <w:rPr>
+          <w:b w:val="0"/>
+          <w:color w:val="4A4A49"/>
+          <w:sz w:val="22"/>
+        </w:rPr>
+        <w:t>SI PREGUNTAN:</w:t>
+      </w:r>
+    </w:p>
+    <w:p>
+      <w:pPr>
+        <w:pStyle w:val="ListBullet"/>
+      </w:pPr>
+      <w:r>
+        <w:rPr>
+          <w:b w:val="0"/>
+          <w:color w:val="4A4A49"/>
+          <w:sz w:val="22"/>
+        </w:rPr>
+        <w:t>«¿UNIQUE deja tener varios veterinarios sin tarjeta?» → Sí: en PostgreSQL dos NULL no se consideran iguales, así que UNIQUE admite varios nulos. Lo que no admite es la misma tarjeta dos veces.</w:t>
+      </w:r>
+    </w:p>
+    <w:p>
+      <w:r>
+        <w:rPr>
+          <w:b w:val="0"/>
+          <w:color w:val="4A4A49"/>
+          <w:sz w:val="22"/>
+        </w:rPr>
+        <w:t>CUIDADO: El CHECK distingue mayúsculas: 'Cirugia' no es 'CIRUGIA' y se rechaza con «violates check constraint "veterinario_especialidad_check"». Decide el formato del dominio y úsalo igual en todos los INSERT.</w:t>
+      </w:r>
+    </w:p>
+    <w:p>
+      <w:r>
+        <w:rPr>
+          <w:b w:val="0"/>
+          <w:color w:val="4A4A49"/>
+          <w:sz w:val="22"/>
+        </w:rPr>
+        <w:t>PASA A LA SIGUIENTE: Con las tablas unidas por FK, la consulta típica las recorre con JOIN.</w:t>
+      </w:r>
+    </w:p>
+    <w:p>
+      <w:pPr>
+        <w:spacing w:before="200" w:after="60"/>
+      </w:pPr>
+      <w:r>
+        <w:rPr>
+          <w:b/>
+          <w:color w:val="1A1C1D"/>
+          <w:sz w:val="32"/>
+        </w:rPr>
+        <w:t>[Slide 10] El JOIN de tres tablas</w:t>
+      </w:r>
+    </w:p>
+    <w:p>
+      <w:r>
+        <w:rPr>
+          <w:b w:val="0"/>
+          <w:color w:val="4A4A49"/>
+          <w:sz w:val="22"/>
+        </w:rPr>
+        <w:t>QUÉ ES (dilo así): La consulta más común del sistema: la agenda con el nombre de la mascota y de su dueño. Cada JOIN sigue una clave foránea del diagrama: cita llega a mascota por id_mascota, y mascota llega a dueño por id_dueno.</w:t>
+      </w:r>
+    </w:p>
+    <w:p>
+      <w:r>
+        <w:rPr>
+          <w:b w:val="0"/>
+          <w:color w:val="4A4A49"/>
+          <w:sz w:val="22"/>
+        </w:rPr>
+        <w:t>CÓMO DARLA (≈3 min):</w:t>
+      </w:r>
+    </w:p>
+    <w:p>
+      <w:pPr>
+        <w:pStyle w:val="ListBullet"/>
+      </w:pPr>
+      <w:r>
+        <w:rPr>
+          <w:b w:val="0"/>
+          <w:color w:val="4A4A49"/>
+          <w:sz w:val="22"/>
+        </w:rPr>
+        <w:t>Líneas 1-4: Las columnas que se muestran, con alias: m.nombre AS mascota y d.nombre AS dueno, porque las dos tablas tienen una columna nombre.</w:t>
+      </w:r>
+    </w:p>
+    <w:p>
+      <w:pPr>
+        <w:pStyle w:val="ListBullet"/>
+      </w:pPr>
+      <w:r>
+        <w:rPr>
+          <w:b w:val="0"/>
+          <w:color w:val="4A4A49"/>
+          <w:sz w:val="22"/>
+        </w:rPr>
+        <w:t>Líneas 5-7: FROM cita y dos JOIN, cada uno con su ON sobre la FK.</w:t>
+      </w:r>
+    </w:p>
+    <w:p>
+      <w:pPr>
+        <w:pStyle w:val="ListBullet"/>
+      </w:pPr>
+      <w:r>
+        <w:rPr>
+          <w:b w:val="0"/>
+          <w:color w:val="4A4A49"/>
+          <w:sz w:val="22"/>
+        </w:rPr>
+        <w:t>Líneas 8-10: El WHERE filtra después de unir: citas desde el 1 de septiembre y solo mascotas activas; ORDER BY por fecha y hora.</w:t>
+      </w:r>
+    </w:p>
+    <w:p>
+      <w:r>
+        <w:rPr>
+          <w:b w:val="0"/>
+          <w:color w:val="4A4A49"/>
+          <w:sz w:val="22"/>
+        </w:rPr>
+        <w:t>EJEMPLO: Con los datos de práctica (10 citas, ninguna de Rocky ni de Kiara, que están inactivas) devuelve 10 filas; la primera es Firulais, de Ana Gomez, el 1 de septiembre a las 08:00.</w:t>
+      </w:r>
+    </w:p>
+    <w:p>
+      <w:r>
+        <w:rPr>
+          <w:b w:val="0"/>
+          <w:color w:val="4A4A49"/>
+          <w:sz w:val="22"/>
+        </w:rPr>
+        <w:t>SI PREGUNTAN:</w:t>
+      </w:r>
+    </w:p>
+    <w:p>
+      <w:pPr>
+        <w:pStyle w:val="ListBullet"/>
+      </w:pPr>
+      <w:r>
+        <w:rPr>
+          <w:b w:val="0"/>
+          <w:color w:val="4A4A49"/>
+          <w:sz w:val="22"/>
+        </w:rPr>
+        <w:t>«¿Da lo mismo poner m.activa = 'S' en el WHERE o en el ON?» → Con JOIN interno, sí. Con LEFT JOIN no: en el ON conserva la cita con la mascota en nulo; en el WHERE la elimina.</w:t>
+      </w:r>
+    </w:p>
+    <w:p>
+      <w:r>
+        <w:rPr>
+          <w:b w:val="0"/>
+          <w:color w:val="4A4A49"/>
+          <w:sz w:val="22"/>
+        </w:rPr>
+        <w:t>CUIDADO: Lee bien la leyenda: el producto cartesiano sale con la coma (FROM cita c, mascota m sin la condición da 10 × 8 = 80 filas) o con CROSS JOIN; con JOIN sin ON, PostgreSQL responde error de sintaxis. El riesgo real es un ON equivocado, que no da error y devuelve filas que no corresponden.</w:t>
+      </w:r>
+    </w:p>
+    <w:p>
+      <w:r>
+        <w:rPr>
+          <w:b w:val="0"/>
+          <w:color w:val="4A4A49"/>
+          <w:sz w:val="22"/>
+        </w:rPr>
+        <w:t>PASA A LA SIGUIENTE: Cada JOIN se apoya en una clave primaria. ¿Cuál columna debe serlo?</w:t>
+      </w:r>
+    </w:p>
+    <w:p>
+      <w:pPr>
+        <w:spacing w:before="200" w:after="60"/>
+      </w:pPr>
+      <w:r>
+        <w:rPr>
+          <w:b/>
+          <w:color w:val="1A1C1D"/>
+          <w:sz w:val="32"/>
+        </w:rPr>
+        <w:t>[Slide 11] Clave primaria: natural o sustituta</w:t>
+      </w:r>
+    </w:p>
+    <w:p>
+      <w:r>
+        <w:rPr>
+          <w:b w:val="0"/>
+          <w:color w:val="4A4A49"/>
+          <w:sz w:val="22"/>
+        </w:rPr>
+        <w:t>QUÉ ES (dilo así): Toda tabla necesita una clave primaria: la columna que identifica una fila sin ambigüedad. Eso no se discute; lo que se decide es cuál. La natural es un dato del mundo real; la sustituta es un número sin significado que genera la base. En la clínica gana la sustituta, y el dato natural se guarda aparte con UNIQUE.</w:t>
+      </w:r>
+    </w:p>
+    <w:p>
+      <w:r>
+        <w:rPr>
+          <w:b w:val="0"/>
+          <w:color w:val="4A4A49"/>
+          <w:sz w:val="22"/>
+        </w:rPr>
+        <w:t>CÓMO DARLA (≈3 min):</w:t>
+      </w:r>
+    </w:p>
+    <w:p>
+      <w:pPr>
+        <w:pStyle w:val="ListBullet"/>
+      </w:pPr>
+      <w:r>
+        <w:rPr>
+          <w:b w:val="0"/>
+          <w:color w:val="4A4A49"/>
+          <w:sz w:val="22"/>
+        </w:rPr>
+        <w:t>Al entrar: Arriba, la definición: no se repite y no admite nulos. «No es estilo: el motor lo revisa en cada INSERT y UPDATE». Pregunta: «¿cuál columna de dueño usarían?».</w:t>
+      </w:r>
+    </w:p>
+    <w:p>
+      <w:pPr>
+        <w:pStyle w:val="ListBullet"/>
+      </w:pPr>
+      <w:r>
+        <w:rPr>
+          <w:b w:val="0"/>
+          <w:color w:val="4A4A49"/>
+          <w:sz w:val="22"/>
+        </w:rPr>
+        <w:t>Clic 1: La natural, cédula o microchip, y sus tres fallas en la clínica: el dueño llega sin la cédula a la mano, el microchip se digita mal y hay que corregirlo, y la mascota rescatada no tiene microchip.</w:t>
+      </w:r>
+    </w:p>
+    <w:p>
+      <w:pPr>
+        <w:pStyle w:val="ListBullet"/>
+      </w:pPr>
+      <w:r>
+        <w:rPr>
+          <w:b w:val="0"/>
+          <w:color w:val="4A4A49"/>
+          <w:sz w:val="22"/>
+        </w:rPr>
+        <w:t>Clic 2: La sustituta: la genera la base, no significa nada y nunca se corrige. Lee la regla de abajo y aclara que es convención de oficio, no regla del motor.</w:t>
+      </w:r>
+    </w:p>
+    <w:p>
+      <w:r>
+        <w:rPr>
+          <w:b w:val="0"/>
+          <w:color w:val="4A4A49"/>
+          <w:sz w:val="22"/>
+        </w:rPr>
+        <w:t>EJEMPLO: dueno(id_dueno SERIAL PRIMARY KEY, cedula VARCHAR(20) UNIQUE, ...): la cédula no se repite, puede quedar nula un rato y se corrige sin tocar las mascotas, que apuntan a id_dueno.</w:t>
+      </w:r>
+    </w:p>
+    <w:p>
+      <w:r>
+        <w:rPr>
+          <w:b w:val="0"/>
+          <w:color w:val="4A4A49"/>
+          <w:sz w:val="22"/>
+        </w:rPr>
+        <w:t>SI PREGUNTAN:</w:t>
+      </w:r>
+    </w:p>
+    <w:p>
+      <w:pPr>
+        <w:pStyle w:val="ListBullet"/>
+      </w:pPr>
+      <w:r>
+        <w:rPr>
+          <w:b w:val="0"/>
+          <w:color w:val="4A4A49"/>
+          <w:sz w:val="22"/>
+        </w:rPr>
+        <w:t>«¿La clave primaria tiene que ser la primera columna y autoincremental?» → No. El orden de las columnas no le importa al motor, y el autoincremento es solo una forma cómoda de generar valores sustitutos.</w:t>
+      </w:r>
+    </w:p>
+    <w:p>
+      <w:pPr>
+        <w:pStyle w:val="ListBullet"/>
+      </w:pPr>
+      <w:r>
+        <w:rPr>
+          <w:b w:val="0"/>
+          <w:color w:val="4A4A49"/>
+          <w:sz w:val="22"/>
+        </w:rPr>
+        <w:t>«¿La natural no ahorra un JOIN?» → Sí, cuando se busca por ella. Pero si cambia, hay que corregirla en todas las tablas que la referencian; la sustituta nunca cambia.</w:t>
+      </w:r>
+    </w:p>
+    <w:p>
+      <w:r>
+        <w:rPr>
+          <w:b w:val="0"/>
+          <w:color w:val="4A4A49"/>
+          <w:sz w:val="22"/>
+        </w:rPr>
+        <w:t>CUIDADO: No digas que la natural «está mal»: es válida cuando el dato es estable y lo controla la propia organización. La regla es sobre quién controla el valor.</w:t>
+      </w:r>
+    </w:p>
+    <w:p>
+      <w:r>
+        <w:rPr>
+          <w:b w:val="0"/>
+          <w:color w:val="4A4A49"/>
+          <w:sz w:val="22"/>
+        </w:rPr>
+        <w:t>PASA A LA SIGUIENTE: Elegida la clave, el siguiente error clásico es repetir datos. Primero la enfermedad.</w:t>
+      </w:r>
+    </w:p>
+    <w:p>
+      <w:pPr>
+        <w:spacing w:before="200" w:after="60"/>
+      </w:pPr>
+      <w:r>
+        <w:rPr>
+          <w:b/>
+          <w:color w:val="1A1C1D"/>
+          <w:sz w:val="32"/>
+        </w:rPr>
+        <w:t>[Slide 12] Normalizacion 1FN-3FN: primero la enfermedad</w:t>
+      </w:r>
+    </w:p>
+    <w:p>
+      <w:r>
+        <w:rPr>
+          <w:b w:val="0"/>
+          <w:color w:val="4A4A49"/>
+          <w:sz w:val="22"/>
+        </w:rPr>
+        <w:t>QUÉ ES (dilo así): Normalizar se entiende mejor empezando por el problema. Si un dato se guarda repetido, la base puede contradecirse, no puede registrar cosas que existen y pierde datos al borrar otros. Las tres formas normales son la cura: cada dato vive una sola vez, en la tabla de la que depende.</w:t>
+      </w:r>
+    </w:p>
+    <w:p>
+      <w:r>
+        <w:rPr>
+          <w:b w:val="0"/>
+          <w:color w:val="4A4A49"/>
+          <w:sz w:val="22"/>
+        </w:rPr>
+        <w:t>CÓMO DARLA (≈5 min):</w:t>
+      </w:r>
+    </w:p>
+    <w:p>
+      <w:pPr>
+        <w:pStyle w:val="ListBullet"/>
+      </w:pPr>
+      <w:r>
+        <w:rPr>
+          <w:b w:val="0"/>
+          <w:color w:val="4A4A49"/>
+          <w:sz w:val="22"/>
+        </w:rPr>
+        <w:t>Al entrar: La tabla mal diseñada: cada cita guarda el nombre y el teléfono del dueño. «Ana Pérez aparece dos veces, con su teléfono dos veces».</w:t>
+      </w:r>
+    </w:p>
+    <w:p>
+      <w:pPr>
+        <w:pStyle w:val="ListBullet"/>
+      </w:pPr>
+      <w:r>
+        <w:rPr>
+          <w:b w:val="0"/>
+          <w:color w:val="4A4A49"/>
+          <w:sz w:val="22"/>
+        </w:rPr>
+        <w:t>Clic 1: Actualización: Ana cambia de teléfono y solo se corrige una cita. «¿Cuál es su teléfono? La base guarda dos verdades».</w:t>
+      </w:r>
+    </w:p>
+    <w:p>
+      <w:pPr>
+        <w:pStyle w:val="ListBullet"/>
+      </w:pPr>
+      <w:r>
+        <w:rPr>
+          <w:b w:val="0"/>
+          <w:color w:val="4A4A49"/>
+          <w:sz w:val="22"/>
+        </w:rPr>
+        <w:t>Clic 2: Inserción: un dueño nuevo que todavía no pide cita no se puede registrar, porque su teléfono solo vive en cita.</w:t>
+      </w:r>
+    </w:p>
+    <w:p>
+      <w:pPr>
+        <w:pStyle w:val="ListBullet"/>
+      </w:pPr>
+      <w:r>
+        <w:rPr>
+          <w:b w:val="0"/>
+          <w:color w:val="4A4A49"/>
+          <w:sz w:val="22"/>
+        </w:rPr>
+        <w:t>Clic 3: Borrado: se borra la única cita de Luis Mora y su teléfono desaparece con ella.</w:t>
+      </w:r>
+    </w:p>
+    <w:p>
+      <w:pPr>
+        <w:pStyle w:val="ListBullet"/>
+      </w:pPr>
+      <w:r>
+        <w:rPr>
+          <w:b w:val="0"/>
+          <w:color w:val="4A4A49"/>
+          <w:sz w:val="22"/>
+        </w:rPr>
+        <w:t>Clic 4: La cura: dueno(id_dueno, nombre, telefono) y cita con la referencia al dueño. El teléfono vive una vez.</w:t>
+      </w:r>
+    </w:p>
+    <w:p>
+      <w:r>
+        <w:rPr>
+          <w:b w:val="0"/>
+          <w:color w:val="4A4A49"/>
+          <w:sz w:val="22"/>
+        </w:rPr>
+        <w:t>EJEMPLO: Las tres formas, con la clínica: 1FN, nada de listas en una celda (dos teléfonos juntos van a otra tabla); 2FN, en detalle_factura el nombre del insumo depende solo de id_insumo y sale a insumo, pero el precio unitario se queda porque es el precio del día de la venta; 3FN, la especialidad del veterinario no se guarda en cita: depende de id_veterinario.</w:t>
+      </w:r>
+    </w:p>
+    <w:p>
+      <w:r>
+        <w:rPr>
+          <w:b w:val="0"/>
+          <w:color w:val="4A4A49"/>
+          <w:sz w:val="22"/>
+        </w:rPr>
+        <w:t>SI PREGUNTAN:</w:t>
+      </w:r>
+    </w:p>
+    <w:p>
+      <w:pPr>
+        <w:pStyle w:val="ListBullet"/>
+      </w:pPr>
+      <w:r>
+        <w:rPr>
+          <w:b w:val="0"/>
+          <w:color w:val="4A4A49"/>
+          <w:sz w:val="22"/>
+        </w:rPr>
+        <w:t>«Si la pantalla muestra todo junto, ¿por qué no una sola tabla?» → Por costo: el teléfono de un dueño con veinte citas viviría veinte veces y bastaría una actualización parcial para que el sistema mienta.</w:t>
+      </w:r>
+    </w:p>
+    <w:p>
+      <w:pPr>
+        <w:pStyle w:val="ListBullet"/>
+      </w:pPr>
+      <w:r>
+        <w:rPr>
+          <w:b w:val="0"/>
+          <w:color w:val="4A4A49"/>
+          <w:sz w:val="22"/>
+        </w:rPr>
+        <w:t>«¿El precio_unit de detalle_factura no es redundante?» → No: es el precio histórico. Si se recalculara con el precio actual, reimprimir una factura de hace seis meses daría otra cifra.</w:t>
+      </w:r>
+    </w:p>
+    <w:p>
+      <w:r>
+        <w:rPr>
+          <w:b w:val="0"/>
+          <w:color w:val="4A4A49"/>
+          <w:sz w:val="22"/>
+        </w:rPr>
+        <w:t>CUIDADO: No dictes 1FN-2FN-3FN como una escalera de definiciones sin mostrar una anomalía concreta: el grupo termina normalizando por ritual y partiendo tablas que nunca se consultan por separado.</w:t>
+      </w:r>
+    </w:p>
+    <w:p>
+      <w:r>
+        <w:rPr>
+          <w:b w:val="0"/>
+          <w:color w:val="4A4A49"/>
+          <w:sz w:val="22"/>
+        </w:rPr>
+        <w:t>PASA A LA SIGUIENTE: Al separar tablas, alguien tiene que garantizar que las referencias apunten a algo real: la clave foránea.</w:t>
+      </w:r>
+    </w:p>
+    <w:p>
+      <w:pPr>
+        <w:spacing w:before="200" w:after="60"/>
+      </w:pPr>
+      <w:r>
+        <w:rPr>
+          <w:b/>
+          <w:color w:val="1A1C1D"/>
+          <w:sz w:val="32"/>
+        </w:rPr>
+        <w:t>[Slide 13] Clave foranea, borrado y por que la FK no basta</w:t>
+      </w:r>
+    </w:p>
+    <w:p>
+      <w:r>
+        <w:rPr>
+          <w:b w:val="0"/>
+          <w:color w:val="4A4A49"/>
+          <w:sz w:val="22"/>
+        </w:rPr>
+        <w:t>QUÉ ES (dilo así): La clave foránea hace que el motor se niegue a guardar una referencia inventada. Esa es la mitad que todos conocen. La otra mitad es qué pasa cuando se intenta borrar la fila a la que otros apuntan: eso se decide al declarar la FK, y si no se decide, el estándar impide el borrado.</w:t>
+      </w:r>
+    </w:p>
+    <w:p>
+      <w:r>
+        <w:rPr>
+          <w:b w:val="0"/>
+          <w:color w:val="4A4A49"/>
+          <w:sz w:val="22"/>
+        </w:rPr>
+        <w:t>CÓMO DARLA (≈3 min):</w:t>
+      </w:r>
+    </w:p>
+    <w:p>
+      <w:pPr>
+        <w:pStyle w:val="ListBullet"/>
+      </w:pPr>
+      <w:r>
+        <w:rPr>
+          <w:b w:val="0"/>
+          <w:color w:val="4A4A49"/>
+          <w:sz w:val="22"/>
+        </w:rPr>
+        <w:t>Al entrar: Dos tablas: las citas apuntan a mascotas que existen (1 y 2). «La flecha es la FK: cita.id_mascota debe existir en mascota».</w:t>
+      </w:r>
+    </w:p>
+    <w:p>
+      <w:pPr>
+        <w:pStyle w:val="ListBullet"/>
+      </w:pPr>
+      <w:r>
+        <w:rPr>
+          <w:b w:val="0"/>
+          <w:color w:val="4A4A49"/>
+          <w:sz w:val="22"/>
+        </w:rPr>
+        <w:t>Clic 1: El INSERT con id_mascota 999: el motor lo rechaza y nombra la restricción violada, cita_id_mascota_fkey. Nada se insertó.</w:t>
+      </w:r>
+    </w:p>
+    <w:p>
+      <w:pPr>
+        <w:pStyle w:val="ListBullet"/>
+      </w:pPr>
+      <w:r>
+        <w:rPr>
+          <w:b w:val="0"/>
+          <w:color w:val="4A4A49"/>
+          <w:sz w:val="22"/>
+        </w:rPr>
+        <w:t>Clic 2: El DELETE de la mascota 1, que tiene citas: rechazado. «Sin cláusula ON DELETE el comportamiento es restrictivo; eso es regla del estándar SQL, no una costumbre».</w:t>
+      </w:r>
+    </w:p>
+    <w:p>
+      <w:r>
+        <w:rPr>
+          <w:b w:val="0"/>
+          <w:color w:val="4A4A49"/>
+          <w:sz w:val="22"/>
+        </w:rPr>
+        <w:t>EJEMPLO: Decisión por relación: mascota → dueño, restrictiva (borrar un dueño no puede evaporar el historial); consulta → cita, restrictiva; detalle_factura → factura, CASCADE (una línea no significa nada sin su factura); detalle_factura → insumo, restrictiva (no se borra un insumo ya facturado).</w:t>
+      </w:r>
+    </w:p>
+    <w:p>
+      <w:r>
+        <w:rPr>
+          <w:b w:val="0"/>
+          <w:color w:val="4A4A49"/>
+          <w:sz w:val="22"/>
+        </w:rPr>
+        <w:t>SI PREGUNTAN:</w:t>
+      </w:r>
+    </w:p>
+    <w:p>
+      <w:pPr>
+        <w:pStyle w:val="ListBullet"/>
+      </w:pPr>
+      <w:r>
+        <w:rPr>
+          <w:b w:val="0"/>
+          <w:color w:val="4A4A49"/>
+          <w:sz w:val="22"/>
+        </w:rPr>
+        <w:t>«¿Qué diferencia hay entre RESTRICT y NO ACTION?» → Las dos impiden borrar el padre con hijos. NO ACTION, la opción por omisión, revisa al final de la sentencia y puede diferirse; RESTRICT revisa de inmediato. Para este curso se comportan igual.</w:t>
+      </w:r>
+    </w:p>
+    <w:p>
+      <w:r>
+        <w:rPr>
+          <w:b w:val="0"/>
+          <w:color w:val="4A4A49"/>
+          <w:sz w:val="22"/>
+        </w:rPr>
+        <w:t>CUIDADO: CASCADE en mascota → dueño parece cómodo y es peligroso: un DELETE de un dueño se llevaría sus mascotas y, en cadena, sus citas y su historia clínica.</w:t>
+      </w:r>
+    </w:p>
+    <w:p>
+      <w:r>
+        <w:rPr>
+          <w:b w:val="0"/>
+          <w:color w:val="4A4A49"/>
+          <w:sz w:val="22"/>
+        </w:rPr>
+        <w:t>PASA A LA SIGUIENTE: Veamos cómo se declara la FK con su comportamiento al borrar.</w:t>
+      </w:r>
+    </w:p>
+    <w:p>
+      <w:pPr>
+        <w:spacing w:before="200" w:after="60"/>
+      </w:pPr>
+      <w:r>
+        <w:rPr>
+          <w:b/>
+          <w:color w:val="1A1C1D"/>
+          <w:sz w:val="32"/>
+        </w:rPr>
+        <w:t>[Slide 14] La clave foranea y que pasa al borrar el padre</w:t>
+      </w:r>
+    </w:p>
+    <w:p>
+      <w:r>
+        <w:rPr>
+          <w:b w:val="0"/>
+          <w:color w:val="4A4A49"/>
+          <w:sz w:val="22"/>
+        </w:rPr>
+        <w:t>QUÉ ES (dilo así): Dos cosas en un mismo código: la tabla insumo con sus reglas, y una FK agregada después con ALTER TABLE, donde se declara explícitamente qué pasa al borrar el insumo referenciado.</w:t>
+      </w:r>
+    </w:p>
+    <w:p>
+      <w:r>
+        <w:rPr>
+          <w:b w:val="0"/>
+          <w:color w:val="4A4A49"/>
+          <w:sz w:val="22"/>
+        </w:rPr>
+        <w:t>CÓMO DARLA (≈2 min):</w:t>
+      </w:r>
+    </w:p>
+    <w:p>
+      <w:pPr>
+        <w:pStyle w:val="ListBullet"/>
+      </w:pPr>
+      <w:r>
+        <w:rPr>
+          <w:b w:val="0"/>
+          <w:color w:val="4A4A49"/>
+          <w:sz w:val="22"/>
+        </w:rPr>
+        <w:t>Líneas 1-6: insumo: stock entero, por defecto 0 y nunca negativo (CHECK stock &gt;= 0); precio_unit mayor que cero.</w:t>
+      </w:r>
+    </w:p>
+    <w:p>
+      <w:pPr>
+        <w:pStyle w:val="ListBullet"/>
+      </w:pPr>
+      <w:r>
+        <w:rPr>
+          <w:b w:val="0"/>
+          <w:color w:val="4A4A49"/>
+          <w:sz w:val="22"/>
+        </w:rPr>
+        <w:t>Líneas 8-9: El comentario: si no se declara, PostgreSQL asume NO ACTION y se niega a borrar.</w:t>
+      </w:r>
+    </w:p>
+    <w:p>
+      <w:pPr>
+        <w:pStyle w:val="ListBullet"/>
+      </w:pPr>
+      <w:r>
+        <w:rPr>
+          <w:b w:val="0"/>
+          <w:color w:val="4A4A49"/>
+          <w:sz w:val="22"/>
+        </w:rPr>
+        <w:t>Líneas 10-13: ALTER TABLE detalle_factura ADD CONSTRAINT fk_detalle_insumo ... ON DELETE RESTRICT: el nombre de la restricción lo elegimos nosotros y es el que aparecerá en el mensaje de error.</w:t>
+      </w:r>
+    </w:p>
+    <w:p>
+      <w:r>
+        <w:rPr>
+          <w:b w:val="0"/>
+          <w:color w:val="4A4A49"/>
+          <w:sz w:val="22"/>
+        </w:rPr>
+        <w:t>EJEMPLO: Con un insumo ya facturado, DELETE FROM insumo WHERE id_insumo = 1 responde: «update or delete on table "insumo" violates RESTRICT setting of foreign key constraint "fk_detalle_insumo" on table "detalle_factura"».</w:t>
+      </w:r>
+    </w:p>
+    <w:p>
+      <w:r>
+        <w:rPr>
+          <w:b w:val="0"/>
+          <w:color w:val="4A4A49"/>
+          <w:sz w:val="22"/>
+        </w:rPr>
+        <w:t>SI PREGUNTAN:</w:t>
+      </w:r>
+    </w:p>
+    <w:p>
+      <w:pPr>
+        <w:pStyle w:val="ListBullet"/>
+      </w:pPr>
+      <w:r>
+        <w:rPr>
+          <w:b w:val="0"/>
+          <w:color w:val="4A4A49"/>
+          <w:sz w:val="22"/>
+        </w:rPr>
+        <w:t>«¿Por qué ponerle nombre a la restricción?» → Porque el nombre sale en el error: fk_detalle_insumo dice qué se violó; un nombre automático obliga a buscarlo en el catálogo.</w:t>
+      </w:r>
+    </w:p>
+    <w:p>
+      <w:r>
+        <w:rPr>
+          <w:b w:val="0"/>
+          <w:color w:val="4A4A49"/>
+          <w:sz w:val="22"/>
+        </w:rPr>
+        <w:t>CUIDADO: El CHECK (stock &gt;= 0) de esta tabla es el que la Clase 4 retira a propósito en su demo; aquí queda como la primera defensa del stock.</w:t>
+      </w:r>
+    </w:p>
+    <w:p>
+      <w:r>
+        <w:rPr>
+          <w:b w:val="0"/>
+          <w:color w:val="4A4A49"/>
+          <w:sz w:val="22"/>
+        </w:rPr>
+        <w:t>PASA A LA SIGUIENTE: Y así se ve, palabra por palabra, el error que devuelve el motor.</w:t>
+      </w:r>
+    </w:p>
+    <w:p>
+      <w:pPr>
+        <w:spacing w:before="200" w:after="60"/>
+      </w:pPr>
+      <w:r>
+        <w:rPr>
+          <w:b/>
+          <w:color w:val="1A1C1D"/>
+          <w:sz w:val="32"/>
+        </w:rPr>
+        <w:t>[Slide 15] Integridad referencial: el error que devuelve el motor</w:t>
+      </w:r>
+    </w:p>
+    <w:p>
+      <w:r>
+        <w:rPr>
+          <w:b w:val="0"/>
+          <w:color w:val="4A4A49"/>
+          <w:sz w:val="22"/>
+        </w:rPr>
+        <w:t>QUÉ ES (dilo así): Integridad referencial en vivo: el mismo INSERT funciona con una mascota que existe y falla con una que no. Lo importante es aprender a leer el mensaje del motor.</w:t>
+      </w:r>
+    </w:p>
+    <w:p>
+      <w:r>
+        <w:rPr>
+          <w:b w:val="0"/>
+          <w:color w:val="4A4A49"/>
+          <w:sz w:val="22"/>
+        </w:rPr>
+        <w:t>CÓMO DARLA (≈2 min):</w:t>
+      </w:r>
+    </w:p>
+    <w:p>
+      <w:pPr>
+        <w:pStyle w:val="ListBullet"/>
+      </w:pPr>
+      <w:r>
+        <w:rPr>
+          <w:b w:val="0"/>
+          <w:color w:val="4A4A49"/>
+          <w:sz w:val="22"/>
+        </w:rPr>
+        <w:t>Líneas 2-4: Cita para la mascota 1, que existe: INSERT 0 1, una fila insertada.</w:t>
+      </w:r>
+    </w:p>
+    <w:p>
+      <w:pPr>
+        <w:pStyle w:val="ListBullet"/>
+      </w:pPr>
+      <w:r>
+        <w:rPr>
+          <w:b w:val="0"/>
+          <w:color w:val="4A4A49"/>
+          <w:sz w:val="22"/>
+        </w:rPr>
+        <w:t>Líneas 6-10: Cita para la mascota 999: el error dice la tabla (cita), la restricción (cita_id_mascota_fkey) y, en DETAIL, la clave que falta: (id_mascota)=(999) no está en mascota.</w:t>
+      </w:r>
+    </w:p>
+    <w:p>
+      <w:r>
+        <w:rPr>
+          <w:b w:val="0"/>
+          <w:color w:val="4A4A49"/>
+          <w:sz w:val="22"/>
+        </w:rPr>
+        <w:t>EJEMPLO: Después del error, SELECT COUNT(*) FROM cita muestra el mismo número que antes del segundo INSERT: la sentencia que falla no deja nada.</w:t>
+      </w:r>
+    </w:p>
+    <w:p>
+      <w:r>
+        <w:rPr>
+          <w:b w:val="0"/>
+          <w:color w:val="4A4A49"/>
+          <w:sz w:val="22"/>
+        </w:rPr>
+        <w:t>SI PREGUNTAN:</w:t>
+      </w:r>
+    </w:p>
+    <w:p>
+      <w:pPr>
+        <w:pStyle w:val="ListBullet"/>
+      </w:pPr>
+      <w:r>
+        <w:rPr>
+          <w:b w:val="0"/>
+          <w:color w:val="4A4A49"/>
+          <w:sz w:val="22"/>
+        </w:rPr>
+        <w:t>«¿De dónde sale el nombre cita_id_mascota_fkey?» → PostgreSQL lo arma solo cuando la FK no tiene nombre: tabla, columna y el sufijo fkey.</w:t>
+      </w:r>
+    </w:p>
+    <w:p>
+      <w:r>
+        <w:rPr>
+          <w:b w:val="0"/>
+          <w:color w:val="4A4A49"/>
+          <w:sz w:val="22"/>
+        </w:rPr>
+        <w:t>PASA A LA SIGUIENTE: Ahora, por qué en un sistema real casi nunca se borra una mascota.</w:t>
+      </w:r>
+    </w:p>
+    <w:p>
+      <w:pPr>
+        <w:spacing w:before="200" w:after="60"/>
+      </w:pPr>
+      <w:r>
+        <w:rPr>
+          <w:b/>
+          <w:color w:val="1A1C1D"/>
+          <w:sz w:val="32"/>
+        </w:rPr>
+        <w:t>[Slide 16] Baja logica: activa CHAR(1) en vez de DELETE</w:t>
+      </w:r>
+    </w:p>
+    <w:p>
+      <w:r>
+        <w:rPr>
+          <w:b w:val="0"/>
+          <w:color w:val="4A4A49"/>
+          <w:sz w:val="22"/>
+        </w:rPr>
+        <w:t>QUÉ ES (dilo así): Una mascota que ya no viene no se borra: se marca como inactiva. Borrar falla por integridad, destruye el historial y es irreversible; marcar conserva todo y se puede deshacer. La consecuencia importante es que la regla «una mascota inactiva no agenda» ya no la defiende la FK.</w:t>
+      </w:r>
+    </w:p>
+    <w:p>
+      <w:r>
+        <w:rPr>
+          <w:b w:val="0"/>
+          <w:color w:val="4A4A49"/>
+          <w:sz w:val="22"/>
+        </w:rPr>
+        <w:t>CÓMO DARLA (≈3 min):</w:t>
+      </w:r>
+    </w:p>
+    <w:p>
+      <w:pPr>
+        <w:pStyle w:val="ListBullet"/>
+      </w:pPr>
+      <w:r>
+        <w:rPr>
+          <w:b w:val="0"/>
+          <w:color w:val="4A4A49"/>
+          <w:sz w:val="22"/>
+        </w:rPr>
+        <w:t>Al entrar: Izquierda, el borrado físico: Luna tiene citas, consultas y facturas colgando. Tres problemas: la integridad lo impide, se pierde la historia y es irreversible.</w:t>
+      </w:r>
+    </w:p>
+    <w:p>
+      <w:pPr>
+        <w:pStyle w:val="ListBullet"/>
+      </w:pPr>
+      <w:r>
+        <w:rPr>
+          <w:b w:val="0"/>
+          <w:color w:val="4A4A49"/>
+          <w:sz w:val="22"/>
+        </w:rPr>
+        <w:t>Clic 1: Derecha, la baja lógica: UPDATE mascota SET activa = 'N'. Las referencias siguen válidas, el historial queda intacto y se revierte con activa = 'S'.</w:t>
+      </w:r>
+    </w:p>
+    <w:p>
+      <w:pPr>
+        <w:pStyle w:val="ListBullet"/>
+      </w:pPr>
+      <w:r>
+        <w:rPr>
+          <w:b w:val="0"/>
+          <w:color w:val="4A4A49"/>
+          <w:sz w:val="22"/>
+        </w:rPr>
+        <w:t>Clic 2: Abajo, cómo se declara (activa CHAR(1) DEFAULT 'S' CHECK (activa IN ('S','N'))), que las consultas del día filtran WHERE activa = 'S', y el aviso: para la FK la mascota inactiva sigue existiendo.</w:t>
+      </w:r>
+    </w:p>
+    <w:p>
+      <w:r>
+        <w:rPr>
+          <w:b w:val="0"/>
+          <w:color w:val="4A4A49"/>
+          <w:sz w:val="22"/>
+        </w:rPr>
+        <w:t>EJEMPLO: UPDATE mascota SET activa = 0 WHERE id_mascota = 2; falla con «violates check constraint "mascota_activa_check"»: los valores son 'S' y 'N', no 0 y 1.</w:t>
+      </w:r>
+    </w:p>
+    <w:p>
+      <w:r>
+        <w:rPr>
+          <w:b w:val="0"/>
+          <w:color w:val="4A4A49"/>
+          <w:sz w:val="22"/>
+        </w:rPr>
+        <w:t>SI PREGUNTAN:</w:t>
+      </w:r>
+    </w:p>
+    <w:p>
+      <w:pPr>
+        <w:pStyle w:val="ListBullet"/>
+      </w:pPr>
+      <w:r>
+        <w:rPr>
+          <w:b w:val="0"/>
+          <w:color w:val="4A4A49"/>
+          <w:sz w:val="22"/>
+        </w:rPr>
+        <w:t>«Entonces, ¿quién impide agendar a una mascota inactiva?» → Un CHECK no puede (mira solo su propia fila, y activa vive en otra tabla). Lo resuelve un procedimiento almacenado (Clase 3) o un trigger (Clase 4).</w:t>
+      </w:r>
+    </w:p>
+    <w:p>
+      <w:r>
+        <w:rPr>
+          <w:b w:val="0"/>
+          <w:color w:val="4A4A49"/>
+          <w:sz w:val="22"/>
+        </w:rPr>
+        <w:t>CUIDADO: Si el grupo sale de hoy pensando en DELETE, en la Clase 3 no va a entender para qué se valida «mascota activa» antes de agendar.</w:t>
+      </w:r>
+    </w:p>
+    <w:p>
+      <w:r>
+        <w:rPr>
+          <w:b w:val="0"/>
+          <w:color w:val="4A4A49"/>
+          <w:sz w:val="22"/>
+        </w:rPr>
+        <w:t>PASA A LA SIGUIENTE: Comprobémoslo con código: la FK acepta la cita de una mascota inactiva.</w:t>
+      </w:r>
+    </w:p>
+    <w:p>
+      <w:pPr>
+        <w:spacing w:before="200" w:after="60"/>
+      </w:pPr>
+      <w:r>
+        <w:rPr>
+          <w:b/>
+          <w:color w:val="1A1C1D"/>
+          <w:sz w:val="32"/>
+        </w:rPr>
+        <w:t>[Slide 17] Lo que el DDL NO puede defender solo</w:t>
+      </w:r>
+    </w:p>
+    <w:p>
+      <w:r>
+        <w:rPr>
+          <w:b w:val="0"/>
+          <w:color w:val="4A4A49"/>
+          <w:sz w:val="22"/>
+        </w:rPr>
+        <w:t>QUÉ ES (dilo así): El código demuestra el límite del DDL: después de dar de baja a la mascota 1, el motor acepta una cita nueva para ella. La FK garantiza que el identificador existe, no que el negocio lo quiera.</w:t>
+      </w:r>
+    </w:p>
+    <w:p>
+      <w:r>
+        <w:rPr>
+          <w:b w:val="0"/>
+          <w:color w:val="4A4A49"/>
+          <w:sz w:val="22"/>
+        </w:rPr>
+        <w:t>CÓMO DARLA (≈3 min):</w:t>
+      </w:r>
+    </w:p>
+    <w:p>
+      <w:pPr>
+        <w:pStyle w:val="ListBullet"/>
+      </w:pPr>
+      <w:r>
+        <w:rPr>
+          <w:b w:val="0"/>
+          <w:color w:val="4A4A49"/>
+          <w:sz w:val="22"/>
+        </w:rPr>
+        <w:t>Línea 2: UPDATE mascota SET activa = 'N' WHERE id_mascota = 1: la baja lógica.</w:t>
+      </w:r>
+    </w:p>
+    <w:p>
+      <w:pPr>
+        <w:pStyle w:val="ListBullet"/>
+      </w:pPr>
+      <w:r>
+        <w:rPr>
+          <w:b w:val="0"/>
+          <w:color w:val="4A4A49"/>
+          <w:sz w:val="22"/>
+        </w:rPr>
+        <w:t>Líneas 4-6: El INSERT de una cita para la mascota 1: INSERT 0 1. El motor la acepta porque la mascota 1 existe.</w:t>
+      </w:r>
+    </w:p>
+    <w:p>
+      <w:pPr>
+        <w:pStyle w:val="ListBullet"/>
+      </w:pPr>
+      <w:r>
+        <w:rPr>
+          <w:b w:val="0"/>
+          <w:color w:val="4A4A49"/>
+          <w:sz w:val="22"/>
+        </w:rPr>
+        <w:t>Líneas 8-10: Un CHECK tampoco sirve: solo mira columnas de su propia fila, y activa está en mascota, no en cita. Hace falta un procedimiento (Clase 3) o un trigger (Clase 4).</w:t>
+      </w:r>
+    </w:p>
+    <w:p>
+      <w:r>
+        <w:rPr>
+          <w:b w:val="0"/>
+          <w:color w:val="4A4A49"/>
+          <w:sz w:val="22"/>
+        </w:rPr>
+        <w:t>EJEMPLO: Con los datos de práctica, el riesgo se mide con una consulta: citas no canceladas cuya mascota tiene activa = 'N'. Hoy da 0 filas; mañana puede no darlo.</w:t>
+      </w:r>
+    </w:p>
+    <w:p>
+      <w:r>
+        <w:rPr>
+          <w:b w:val="0"/>
+          <w:color w:val="4A4A49"/>
+          <w:sz w:val="22"/>
+        </w:rPr>
+        <w:t>SI PREGUNTAN:</w:t>
+      </w:r>
+    </w:p>
+    <w:p>
+      <w:pPr>
+        <w:pStyle w:val="ListBullet"/>
+      </w:pPr>
+      <w:r>
+        <w:rPr>
+          <w:b w:val="0"/>
+          <w:color w:val="4A4A49"/>
+          <w:sz w:val="22"/>
+        </w:rPr>
+        <w:t>«¿Y si pongo la columna activa también en cita?» → Sería un dato repetido: se desincroniza en cuanto cambie la mascota (la anomalía de actualización de hace un rato).</w:t>
+      </w:r>
+    </w:p>
+    <w:p>
+      <w:r>
+        <w:rPr>
+          <w:b w:val="0"/>
+          <w:color w:val="4A4A49"/>
+          <w:sz w:val="22"/>
+        </w:rPr>
+        <w:t>CUIDADO: Las tres reglas del modelo se reparten así: «stock nunca negativo» sí cabe en un CHECK; «mascota inactiva no agenda» y «todo cambio de estado queda registrado» necesitan lógica programada.</w:t>
+      </w:r>
+    </w:p>
+    <w:p>
+      <w:r>
+        <w:rPr>
+          <w:b w:val="0"/>
+          <w:color w:val="4A4A49"/>
+          <w:sz w:val="22"/>
+        </w:rPr>
+        <w:t>PASA A LA SIGUIENTE: Volvamos al diagrama: ¿qué lo hace un diagrama y no un dibujo?</w:t>
+      </w:r>
+    </w:p>
+    <w:p>
+      <w:pPr>
+        <w:spacing w:before="200" w:after="60"/>
+      </w:pPr>
+      <w:r>
+        <w:rPr>
+          <w:b/>
+          <w:color w:val="1A1C1D"/>
+          <w:sz w:val="32"/>
+        </w:rPr>
+        <w:t>[Slide 18] Que separa un diagrama ER de un dibujo</w:t>
+      </w:r>
+    </w:p>
+    <w:p>
+      <w:r>
+        <w:rPr>
+          <w:b w:val="0"/>
+          <w:color w:val="4A4A49"/>
+          <w:sz w:val="22"/>
+        </w:rPr>
+        <w:t>QUÉ ES (dilo así): Es fácil dibujar cajas y creer que eso es un modelo. Un diagrama entidad-relación bien hecho cumple cinco condiciones que se pueden revisar una por una, y tiene una prueba de aceptación muy simple: alguien más debe poder escribir el CREATE TABLE con solo mirarlo.</w:t>
+      </w:r>
+    </w:p>
+    <w:p>
+      <w:r>
+        <w:rPr>
+          <w:b w:val="0"/>
+          <w:color w:val="4A4A49"/>
+          <w:sz w:val="22"/>
+        </w:rPr>
+        <w:t>CÓMO DARLA (≈3 min):</w:t>
+      </w:r>
+    </w:p>
+    <w:p>
+      <w:pPr>
+        <w:pStyle w:val="ListBullet"/>
+      </w:pPr>
+      <w:r>
+        <w:rPr>
+          <w:b w:val="0"/>
+          <w:color w:val="4A4A49"/>
+          <w:sz w:val="22"/>
+        </w:rPr>
+        <w:t>Al entrar: El dibujo: «Dueños» y «Mascotas» unidos por una línea. «¿Qué tipo tiene el teléfono? ¿Cuántas mascotas puede tener un dueño? El dibujo no lo dice».</w:t>
+      </w:r>
+    </w:p>
+    <w:p>
+      <w:pPr>
+        <w:pStyle w:val="ListBullet"/>
+      </w:pPr>
+      <w:r>
+        <w:rPr>
+          <w:b w:val="0"/>
+          <w:color w:val="4A4A49"/>
+          <w:sz w:val="22"/>
+        </w:rPr>
+        <w:t>Clic 1: El mismo modelo como diagrama: dueno y mascota en singular, PK y FK marcadas, atributos con tipo, cardinalidad 1..1 y 0..N y el verbo «posee».</w:t>
+      </w:r>
+    </w:p>
+    <w:p>
+      <w:pPr>
+        <w:pStyle w:val="ListBullet"/>
+      </w:pPr>
+      <w:r>
+        <w:rPr>
+          <w:b w:val="0"/>
+          <w:color w:val="4A4A49"/>
+          <w:sz w:val="22"/>
+        </w:rPr>
+        <w:t>Clic 2: Las cinco condiciones, una por una; detente en la 4: el mínimo dice si la relación es obligatoria (0..N: un dueño puede no tener mascotas aún).</w:t>
+      </w:r>
+    </w:p>
+    <w:p>
+      <w:pPr>
+        <w:pStyle w:val="ListBullet"/>
+      </w:pPr>
+      <w:r>
+        <w:rPr>
+          <w:b w:val="0"/>
+          <w:color w:val="4A4A49"/>
+          <w:sz w:val="22"/>
+        </w:rPr>
+        <w:t>Clic 3: La prueba de aceptación: otra persona escribe el CREATE TABLE mirándolo, sin preguntar.</w:t>
+      </w:r>
+    </w:p>
+    <w:p>
+      <w:r>
+        <w:rPr>
+          <w:b w:val="0"/>
+          <w:color w:val="4A4A49"/>
+          <w:sz w:val="22"/>
+        </w:rPr>
+        <w:t>EJEMPLO: Cita y consulta son 1 a 1 pero no simétricas: una cita programada aún no tiene consulta, y una consulta no existe sin su cita. Eso se materializa como consulta.id_cita NOT NULL UNIQUE.</w:t>
+      </w:r>
+    </w:p>
+    <w:p>
+      <w:r>
+        <w:rPr>
+          <w:b w:val="0"/>
+          <w:color w:val="4A4A49"/>
+          <w:sz w:val="22"/>
+        </w:rPr>
+        <w:t>SI PREGUNTAN:</w:t>
+      </w:r>
+    </w:p>
+    <w:p>
+      <w:pPr>
+        <w:pStyle w:val="ListBullet"/>
+      </w:pPr>
+      <w:r>
+        <w:rPr>
+          <w:b w:val="0"/>
+          <w:color w:val="4A4A49"/>
+          <w:sz w:val="22"/>
+        </w:rPr>
+        <w:t>«¿Cuánto debe ocupar el diagrama?» → El modelo completo tiene 8 entidades y 7 relaciones y cabe legible en una hoja. Si no cabe, se divide por subsistemas (convención, no norma).</w:t>
+      </w:r>
+    </w:p>
+    <w:p>
+      <w:r>
+        <w:rPr>
+          <w:b w:val="0"/>
+          <w:color w:val="4A4A49"/>
+          <w:sz w:val="22"/>
+        </w:rPr>
+        <w:t>CUIDADO: No aceptes un diagrama sin cardinalidades ni tipos «porque se ve ordenado»: la decisión que falta (¿un veterinario puede tener dos citas en la misma franja?) reaparece cuando ya hay datos y procedimientos escritos encima.</w:t>
+      </w:r>
+    </w:p>
+    <w:p>
+      <w:r>
+        <w:rPr>
+          <w:b w:val="0"/>
+          <w:color w:val="4A4A49"/>
+          <w:sz w:val="22"/>
+        </w:rPr>
+        <w:t>PASA A LA SIGUIENTE: La condición 2 pide tipos: elegirlos mal es donde se pagan las facturas más caras.</w:t>
+      </w:r>
+    </w:p>
+    <w:p>
+      <w:pPr>
+        <w:spacing w:before="200" w:after="60"/>
+      </w:pPr>
+      <w:r>
+        <w:rPr>
+          <w:b/>
+          <w:color w:val="1A1C1D"/>
+          <w:sz w:val="32"/>
+        </w:rPr>
+        <w:t>[Slide 19] Tipos de datos: donde se pagan las facturas mas caras</w:t>
+      </w:r>
+    </w:p>
+    <w:p>
+      <w:r>
+        <w:rPr>
+          <w:b w:val="0"/>
+          <w:color w:val="4A4A49"/>
+          <w:sz w:val="22"/>
+        </w:rPr>
+        <w:t>QUÉ ES (dilo así): Elegir el tipo parece trivial y es donde se pagan los errores más caros, porque cambiarlo después obliga a convertir datos que ya existen. Hay tres casos clásicos: teléfono, fecha y dinero, y una tentación contraria, declarar todo como texto largo.</w:t>
+      </w:r>
+    </w:p>
+    <w:p>
+      <w:r>
+        <w:rPr>
+          <w:b w:val="0"/>
+          <w:color w:val="4A4A49"/>
+          <w:sz w:val="22"/>
+        </w:rPr>
+        <w:t>CÓMO DARLA (≈3 min):</w:t>
+      </w:r>
+    </w:p>
+    <w:p>
+      <w:pPr>
+        <w:pStyle w:val="ListBullet"/>
+      </w:pPr>
+      <w:r>
+        <w:rPr>
+          <w:b w:val="0"/>
+          <w:color w:val="4A4A49"/>
+          <w:sz w:val="22"/>
+        </w:rPr>
+        <w:t>Al entrar: Teléfono: como NUMERIC se pierden el 0 inicial, el + del prefijo y la extensión. Va VARCHAR(30).</w:t>
+      </w:r>
+    </w:p>
+    <w:p>
+      <w:pPr>
+        <w:pStyle w:val="ListBullet"/>
+      </w:pPr>
+      <w:r>
+        <w:rPr>
+          <w:b w:val="0"/>
+          <w:color w:val="4A4A49"/>
+          <w:sz w:val="22"/>
+        </w:rPr>
+        <w:t>Clic 1: Fecha: como VARCHAR(20), ORDER BY ordena como palabras y no se pueden sumar 30 minutos para calcular el fin de la cita. Va TIMESTAMP.</w:t>
+      </w:r>
+    </w:p>
+    <w:p>
+      <w:pPr>
+        <w:pStyle w:val="ListBullet"/>
+      </w:pPr>
+      <w:r>
+        <w:rPr>
+          <w:b w:val="0"/>
+          <w:color w:val="4A4A49"/>
+          <w:sz w:val="22"/>
+        </w:rPr>
+        <w:t>Clic 2: Dinero: FLOAT guarda decimales en binario; 0.1 + 0.2 no da exactamente 0.3 y el total deja de cuadrar con sus líneas. Va DECIMAL(12,2), que en PostgreSQL es lo mismo que NUMERIC(12,2).</w:t>
+      </w:r>
+    </w:p>
+    <w:p>
+      <w:pPr>
+        <w:pStyle w:val="ListBullet"/>
+      </w:pPr>
+      <w:r>
+        <w:rPr>
+          <w:b w:val="0"/>
+          <w:color w:val="4A4A49"/>
+          <w:sz w:val="22"/>
+        </w:rPr>
+        <w:t>Clic 3: La tentación contraria: todo VARCHAR(4000). La base ya no valida nada y cada pantalla tiene que hacerlo por su cuenta.</w:t>
+      </w:r>
+    </w:p>
+    <w:p>
+      <w:r>
+        <w:rPr>
+          <w:b w:val="0"/>
+          <w:color w:val="4A4A49"/>
+          <w:sz w:val="22"/>
+        </w:rPr>
+        <w:t>EJEMPLO: En PostgreSQL, SELECT 0.1::float8 + 0.2::float8 = 0.3::float8 devuelve false; con NUMERIC devuelve true. Y ordenar como texto las fechas '2026-10-02' y '2026-9-15' pone la de septiembre después de la de octubre.</w:t>
+      </w:r>
+    </w:p>
+    <w:p>
+      <w:r>
+        <w:rPr>
+          <w:b w:val="0"/>
+          <w:color w:val="4A4A49"/>
+          <w:sz w:val="22"/>
+        </w:rPr>
+        <w:t>SI PREGUNTAN:</w:t>
+      </w:r>
+    </w:p>
+    <w:p>
+      <w:pPr>
+        <w:pStyle w:val="ListBullet"/>
+      </w:pPr>
+      <w:r>
+        <w:rPr>
+          <w:b w:val="0"/>
+          <w:color w:val="4A4A49"/>
+          <w:sz w:val="22"/>
+        </w:rPr>
+        <w:t>«¿Por qué email VARCHAR(120) y no 50?» → Porque el estándar de correo admite direcciones de hasta 254 caracteres; 120 cubre los casos reales. Son números de convención del curso: nombre 80, teléfono 30, especie 40.</w:t>
+      </w:r>
+    </w:p>
+    <w:p>
+      <w:r>
+        <w:rPr>
+          <w:b w:val="0"/>
+          <w:color w:val="4A4A49"/>
+          <w:sz w:val="22"/>
+        </w:rPr>
+        <w:t>CUIDADO: Si vienes de Oracle: allí el dinero es NUMBER(12,2); en PostgreSQL NUMBER no existe, se escribe NUMERIC o DECIMAL.</w:t>
+      </w:r>
+    </w:p>
+    <w:p>
+      <w:r>
+        <w:rPr>
+          <w:b w:val="0"/>
+          <w:color w:val="4A4A49"/>
+          <w:sz w:val="22"/>
+        </w:rPr>
+        <w:t>PASA A LA SIGUIENTE: Además del tipo, el nombre: una mayúscula puede costar veinte minutos.</w:t>
+      </w:r>
+    </w:p>
+    <w:p>
+      <w:pPr>
+        <w:spacing w:before="200" w:after="60"/>
+      </w:pPr>
+      <w:r>
+        <w:rPr>
+          <w:b/>
+          <w:color w:val="1A1C1D"/>
+          <w:sz w:val="32"/>
+        </w:rPr>
+        <w:t>[Slide 20] Convenciones de nombres para que el DDL corra a la primera</w:t>
+      </w:r>
+    </w:p>
+    <w:p>
+      <w:r>
+        <w:rPr>
+          <w:b w:val="0"/>
+          <w:color w:val="4A4A49"/>
+          <w:sz w:val="22"/>
+        </w:rPr>
+        <w:t>QUÉ ES (dilo así): PostgreSQL convierte a minúsculas cualquier nombre escrito sin comillas. Por eso la regla del curso es simple: todo en minúsculas, singular, sin tildes y sin comillas dobles, y el mismo nombre en el diagrama, en el DDL y en el código Mermaid.</w:t>
+      </w:r>
+    </w:p>
+    <w:p>
+      <w:r>
+        <w:rPr>
+          <w:b w:val="0"/>
+          <w:color w:val="4A4A49"/>
+          <w:sz w:val="22"/>
+        </w:rPr>
+        <w:t>CÓMO DARLA (≈3 min):</w:t>
+      </w:r>
+    </w:p>
+    <w:p>
+      <w:pPr>
+        <w:pStyle w:val="ListBullet"/>
+      </w:pPr>
+      <w:r>
+        <w:rPr>
+          <w:b w:val="0"/>
+          <w:color w:val="4A4A49"/>
+          <w:sz w:val="22"/>
+        </w:rPr>
+        <w:t>Al entrar: CREATE TABLE Mascota crea una tabla llamada mascota: el motor pliega el nombre a minúscula.</w:t>
+      </w:r>
+    </w:p>
+    <w:p>
+      <w:pPr>
+        <w:pStyle w:val="ListBullet"/>
+      </w:pPr>
+      <w:r>
+        <w:rPr>
+          <w:b w:val="0"/>
+          <w:color w:val="4A4A49"/>
+          <w:sz w:val="22"/>
+        </w:rPr>
+        <w:t>Clic 1: SELECT * FROM "Mascota" falla: con comillas el nombre se toma letra a letra y esa tabla no existe. Error real: relation "Mascota" does not exist.</w:t>
+      </w:r>
+    </w:p>
+    <w:p>
+      <w:pPr>
+        <w:pStyle w:val="ListBullet"/>
+      </w:pPr>
+      <w:r>
+        <w:rPr>
+          <w:b w:val="0"/>
+          <w:color w:val="4A4A49"/>
+          <w:sz w:val="22"/>
+        </w:rPr>
+        <w:t>Clic 2: Las cuatro reglas con su ejemplo: mascota, dueno, detalle_factura, y la FK que se lee sola: cita.id_mascota apunta a mascota.id_mascota.</w:t>
+      </w:r>
+    </w:p>
+    <w:p>
+      <w:r>
+        <w:rPr>
+          <w:b w:val="0"/>
+          <w:color w:val="4A4A49"/>
+          <w:sz w:val="22"/>
+        </w:rPr>
+        <w:t>EJEMPLO: El error al revés también existe: CREATE TABLE "Mascota" con comillas y luego SELECT * FROM mascota responde relation "mascota" does not exist.</w:t>
+      </w:r>
+    </w:p>
+    <w:p>
+      <w:r>
+        <w:rPr>
+          <w:b w:val="0"/>
+          <w:color w:val="4A4A49"/>
+          <w:sz w:val="22"/>
+        </w:rPr>
+        <w:t>SI PREGUNTAN:</w:t>
+      </w:r>
+    </w:p>
+    <w:p>
+      <w:pPr>
+        <w:pStyle w:val="ListBullet"/>
+      </w:pPr>
+      <w:r>
+        <w:rPr>
+          <w:b w:val="0"/>
+          <w:color w:val="4A4A49"/>
+          <w:sz w:val="22"/>
+        </w:rPr>
+        <w:t>«¿Por qué singular si la tabla guarda muchas mascotas?» → Porque se nombra por lo que guarda cada fila, y así la FK se lee sola: cita.id_mascota.</w:t>
+      </w:r>
+    </w:p>
+    <w:p>
+      <w:pPr>
+        <w:pStyle w:val="ListBullet"/>
+      </w:pPr>
+      <w:r>
+        <w:rPr>
+          <w:b w:val="0"/>
+          <w:color w:val="4A4A49"/>
+          <w:sz w:val="22"/>
+        </w:rPr>
+        <w:t>«¿Por qué sin eñe?» → Funciona en PostgreSQL, pero complica escribirla en otros teclados, herramientas y motores. dueno se escribe igual en cualquier parte.</w:t>
+      </w:r>
+    </w:p>
+    <w:p>
+      <w:r>
+        <w:rPr>
+          <w:b w:val="0"/>
+          <w:color w:val="4A4A49"/>
+          <w:sz w:val="22"/>
+        </w:rPr>
+        <w:t>CUIDADO: El patrón de identificadores es id_&lt;entidad&gt;, con el mismo nombre en la tabla propia y en la que la referencia: así el JOIN se escribe sin buscar cómo se llamó la columna.</w:t>
+      </w:r>
+    </w:p>
+    <w:p>
+      <w:r>
+        <w:rPr>
+          <w:b w:val="0"/>
+          <w:color w:val="4A4A49"/>
+          <w:sz w:val="22"/>
+        </w:rPr>
+        <w:t>PASA A LA SIGUIENTE: Con qué herramientas se hace todo esto hoy, y qué demuestra cada una.</w:t>
+      </w:r>
+    </w:p>
+    <w:p>
+      <w:pPr>
+        <w:spacing w:before="200" w:after="60"/>
+      </w:pPr>
+      <w:r>
+        <w:rPr>
+          <w:b/>
+          <w:color w:val="1A1C1D"/>
+          <w:sz w:val="32"/>
+        </w:rPr>
+        <w:t>[Slide 21] Herramientas del dia y que se puede demostrar con cada una</w:t>
+      </w:r>
+    </w:p>
+    <w:p>
+      <w:r>
+        <w:rPr>
+          <w:b w:val="0"/>
+          <w:color w:val="4A4A49"/>
+          <w:sz w:val="22"/>
+        </w:rPr>
+        <w:t>QUÉ ES (dilo así): Tres herramientas gratuitas, cada una responde una pregunta: ¿cómo es el modelo? (draw.io o Excalidraw), ¿el DDL corre? (DB Fiddle, que es PostgreSQL real en el navegador) y ¿el diagrama se dibuja? (un visor Mermaid).</w:t>
+      </w:r>
+    </w:p>
+    <w:p>
+      <w:r>
+        <w:rPr>
+          <w:b w:val="0"/>
+          <w:color w:val="4A4A49"/>
+          <w:sz w:val="22"/>
+        </w:rPr>
+        <w:t>CÓMO DARLA (≈2 min):</w:t>
+      </w:r>
+    </w:p>
+    <w:p>
+      <w:pPr>
+        <w:pStyle w:val="ListBullet"/>
+      </w:pPr>
+      <w:r>
+        <w:rPr>
+          <w:b w:val="0"/>
+          <w:color w:val="4A4A49"/>
+          <w:sz w:val="22"/>
+        </w:rPr>
+        <w:t>Al entrar: Recorre las tres cajas de arriba abajo; en la del medio señala el ejemplo: la cita con la mascota 999 y el error de FK que se lee en vivo. Cierra con el recuadro: DB Fiddle recrea el esquema en cada ejecución, así que lo que vale es el archivo .sql guardado en la carpeta del proyecto.</w:t>
+      </w:r>
+    </w:p>
+    <w:p>
+      <w:r>
+        <w:rPr>
+          <w:b w:val="0"/>
+          <w:color w:val="4A4A49"/>
+          <w:sz w:val="22"/>
+        </w:rPr>
+        <w:t>EJEMPLO: La prueba de que el .sql está completo: abrir DB Fiddle vacío, pegar el archivo y reconstruir el esquema con sus datos en menos de cinco minutos.</w:t>
+      </w:r>
+    </w:p>
+    <w:p>
+      <w:r>
+        <w:rPr>
+          <w:b w:val="0"/>
+          <w:color w:val="4A4A49"/>
+          <w:sz w:val="22"/>
+        </w:rPr>
+        <w:t>SI PREGUNTAN:</w:t>
+      </w:r>
+    </w:p>
+    <w:p>
+      <w:pPr>
+        <w:pStyle w:val="ListBullet"/>
+      </w:pPr>
+      <w:r>
+        <w:rPr>
+          <w:b w:val="0"/>
+          <w:color w:val="4A4A49"/>
+          <w:sz w:val="22"/>
+        </w:rPr>
+        <w:t>«¿Y Oracle Live SQL?» → Solo como contraste de sintaxis para quien encuentre Oracle en el trabajo. El motor del curso es PostgreSQL.</w:t>
+      </w:r>
+    </w:p>
+    <w:p>
+      <w:r>
+        <w:rPr>
+          <w:b w:val="0"/>
+          <w:color w:val="4A4A49"/>
+          <w:sz w:val="22"/>
+        </w:rPr>
+        <w:t>CUIDADO: DB Fiddle no tiene usuarios ni roles reales; los permisos de la Clase 2 se practican en PostgreSQL en el navegador con SET ROLE.</w:t>
+      </w:r>
+    </w:p>
+    <w:p>
+      <w:r>
+        <w:rPr>
+          <w:b w:val="0"/>
+          <w:color w:val="4A4A49"/>
+          <w:sz w:val="22"/>
+        </w:rPr>
+        <w:t>PASA A LA SIGUIENTE: La tercera herramienta merece su lámina: del ER dibujado al código Mermaid.</w:t>
+      </w:r>
+    </w:p>
+    <w:p>
+      <w:pPr>
+        <w:spacing w:before="200" w:after="60"/>
+      </w:pPr>
+      <w:r>
+        <w:rPr>
+          <w:b/>
+          <w:color w:val="1A1C1D"/>
+          <w:sz w:val="32"/>
+        </w:rPr>
+        <w:t>[Slide 22] Del ER dibujado al codigo Mermaid</w:t>
+      </w:r>
+    </w:p>
+    <w:p>
+      <w:r>
+        <w:rPr>
+          <w:b w:val="0"/>
+          <w:color w:val="4A4A49"/>
+          <w:sz w:val="22"/>
+        </w:rPr>
+        <w:t>QUÉ ES (dilo así): El diagrama del curso se guarda como texto Mermaid, no como imagen. No hace falta dibujar escribiendo código: se piensa en un boceto, una IA traduce la sintaxis y uno revisa que el modelo sea el suyo. Al final se comprueba en un visor que se dibuje.</w:t>
+      </w:r>
+    </w:p>
+    <w:p>
+      <w:r>
+        <w:rPr>
+          <w:b w:val="0"/>
+          <w:color w:val="4A4A49"/>
+          <w:sz w:val="22"/>
+        </w:rPr>
+        <w:t>CÓMO DARLA (≈3 min):</w:t>
+      </w:r>
+    </w:p>
+    <w:p>
+      <w:pPr>
+        <w:pStyle w:val="ListBullet"/>
+      </w:pPr>
+      <w:r>
+        <w:rPr>
+          <w:b w:val="0"/>
+          <w:color w:val="4A4A49"/>
+          <w:sz w:val="22"/>
+        </w:rPr>
+        <w:t>Al entrar: El camino: boceto en draw.io o Excalidraw, la IA traduce, sale texto erDiagram.</w:t>
+      </w:r>
+    </w:p>
+    <w:p>
+      <w:pPr>
+        <w:pStyle w:val="ListBullet"/>
+      </w:pPr>
+      <w:r>
+        <w:rPr>
+          <w:b w:val="0"/>
+          <w:color w:val="4A4A49"/>
+          <w:sz w:val="22"/>
+        </w:rPr>
+        <w:t>Clic 1: El texto: dueno ||--o{ mascota : posee se lee «un dueño posee cero o muchas mascotas»; dentro de dueno { } van los atributos con su tipo y PK.</w:t>
+      </w:r>
+    </w:p>
+    <w:p>
+      <w:pPr>
+        <w:pStyle w:val="ListBullet"/>
+      </w:pPr>
+      <w:r>
+        <w:rPr>
+          <w:b w:val="0"/>
+          <w:color w:val="4A4A49"/>
+          <w:sz w:val="22"/>
+        </w:rPr>
+        <w:t>Clic 2: La revisión: entidades completas, cardinalidad en el sentido correcto, PK y FK marcadas. «La IA acierta la sintaxis, no tu modelo».</w:t>
+      </w:r>
+    </w:p>
+    <w:p>
+      <w:pPr>
+        <w:pStyle w:val="ListBullet"/>
+      </w:pPr>
+      <w:r>
+        <w:rPr>
+          <w:b w:val="0"/>
+          <w:color w:val="4A4A49"/>
+          <w:sz w:val="22"/>
+        </w:rPr>
+        <w:t>Clic 3: El visor dibuja el diagrama. Si no renderiza, se corrige ahí mismo.</w:t>
+      </w:r>
+    </w:p>
+    <w:p>
+      <w:r>
+        <w:rPr>
+          <w:b w:val="0"/>
+          <w:color w:val="4A4A49"/>
+          <w:sz w:val="22"/>
+        </w:rPr>
+        <w:t>EJEMPLO: En ||--o{ cada lado es un extremo: || es «exactamente uno» del lado de dueno y o{ es «cero o muchos» del lado de mascota.</w:t>
+      </w:r>
+    </w:p>
+    <w:p>
+      <w:r>
+        <w:rPr>
+          <w:b w:val="0"/>
+          <w:color w:val="4A4A49"/>
+          <w:sz w:val="22"/>
+        </w:rPr>
+        <w:t>SI PREGUNTAN:</w:t>
+      </w:r>
+    </w:p>
+    <w:p>
+      <w:pPr>
+        <w:pStyle w:val="ListBullet"/>
+      </w:pPr>
+      <w:r>
+        <w:rPr>
+          <w:b w:val="0"/>
+          <w:color w:val="4A4A49"/>
+          <w:sz w:val="22"/>
+        </w:rPr>
+        <w:t>«¿Puedo entregar el PNG en vez del texto?» → El PNG sirve para un informe, pero la fuente es el texto: es lo que se corrige, se versiona y se compara con el DDL.</w:t>
+      </w:r>
+    </w:p>
+    <w:p>
+      <w:r>
+        <w:rPr>
+          <w:b w:val="0"/>
+          <w:color w:val="4A4A49"/>
+          <w:sz w:val="22"/>
+        </w:rPr>
+        <w:t>CUIDADO: Los nombres del erDiagram deben ser los del DDL: dueno y mascota en minúscula, no DUENO ni Dueños. Si difieren, ya no es el mismo modelo.</w:t>
+      </w:r>
+    </w:p>
+    <w:p>
+      <w:r>
+        <w:rPr>
+          <w:b w:val="0"/>
+          <w:color w:val="4A4A49"/>
+          <w:sz w:val="22"/>
+        </w:rPr>
+        <w:t>PASA A LA SIGUIENTE: Vamos a la demo: todo esto en vivo.</w:t>
+      </w:r>
+    </w:p>
+    <w:p>
+      <w:pPr>
+        <w:spacing w:before="200" w:after="60"/>
+      </w:pPr>
+      <w:r>
+        <w:rPr>
+          <w:b/>
+          <w:color w:val="1A1C1D"/>
+          <w:sz w:val="32"/>
+        </w:rPr>
+        <w:t>[Slide 23] Demo del dia</w:t>
+      </w:r>
+    </w:p>
+    <w:p>
+      <w:r>
+        <w:rPr>
+          <w:b w:val="0"/>
+          <w:color w:val="4A4A49"/>
+          <w:sz w:val="22"/>
+        </w:rPr>
+        <w:t>QUÉ ES (dilo así): La demo junta lo de hoy: un boceto, el DDL que corre en PostgreSQL, el error de integridad leído en vivo y el mismo modelo pasado a Mermaid.</w:t>
+      </w:r>
+    </w:p>
+    <w:p>
+      <w:r>
+        <w:rPr>
+          <w:b w:val="0"/>
+          <w:color w:val="4A4A49"/>
+          <w:sz w:val="22"/>
+        </w:rPr>
+        <w:t>CÓMO DARLA (≈15 min):</w:t>
+      </w:r>
+    </w:p>
+    <w:p>
+      <w:pPr>
+        <w:pStyle w:val="ListBullet"/>
+      </w:pPr>
+      <w:r>
+        <w:rPr>
+          <w:b w:val="0"/>
+          <w:color w:val="4A4A49"/>
+          <w:sz w:val="22"/>
+        </w:rPr>
+        <w:t>Al entrar: 1) Boceto en draw.io: dueño, mascota y cita con sus claves (3 min). 2) En DB Fiddle, el DDL de las tres tablas con PK, FK y CHECK, y los INSERT de Ana Pérez, la perra Luna y su cita; corre el JOIN (5 min). 3) Inserta una cita con la mascota 999 y lee el error en voz alta: tabla, restricción y DETAIL (2 min). 4) Pide a una IA el erDiagram del boceto, pégalo en el visor y compara nombres con el DDL (5 min).</w:t>
+      </w:r>
+    </w:p>
+    <w:p>
+      <w:r>
+        <w:rPr>
+          <w:b w:val="0"/>
+          <w:color w:val="4A4A49"/>
+          <w:sz w:val="22"/>
+        </w:rPr>
+        <w:t>CUIDADO: Lleva el script de la demo en un archivo .sql y pégalo: escribirlo en vivo consume el tiempo de la parte que importa, que es leer el error. Y si la IA devuelve DUENO en mayúsculas, corrígelo frente al grupo: es justo el punto de la lámina de convenciones.</w:t>
+      </w:r>
+    </w:p>
+    <w:p>
+      <w:r>
+        <w:rPr>
+          <w:b w:val="0"/>
+          <w:color w:val="4A4A49"/>
+          <w:sz w:val="22"/>
+        </w:rPr>
+        <w:t>PASA A LA SIGUIENTE: Los cuatro pasos del boceto al código quedan proyectados para la práctica.</w:t>
+      </w:r>
+    </w:p>
+    <w:p>
+      <w:pPr>
+        <w:spacing w:before="200" w:after="60"/>
+      </w:pPr>
+      <w:r>
+        <w:rPr>
+          <w:b/>
+          <w:color w:val="1A1C1D"/>
+          <w:sz w:val="32"/>
+        </w:rPr>
+        <w:t>[Slide 24] Del boceto al código Mermaid</w:t>
+      </w:r>
+    </w:p>
+    <w:p>
+      <w:r>
+        <w:rPr>
+          <w:b w:val="0"/>
+          <w:color w:val="4A4A49"/>
+          <w:sz w:val="22"/>
+        </w:rPr>
+        <w:t>QUÉ ES (dilo así): Los cuatro pasos para pasar de un diagrama dibujado a uno en texto Mermaid. Quedan proyectados mientras el grupo trabaja.</w:t>
+      </w:r>
+    </w:p>
+    <w:p>
+      <w:r>
+        <w:rPr>
+          <w:b w:val="0"/>
+          <w:color w:val="4A4A49"/>
+          <w:sz w:val="22"/>
+        </w:rPr>
+        <w:t>CÓMO DARLA (≈2 min):</w:t>
+      </w:r>
+    </w:p>
+    <w:p>
+      <w:pPr>
+        <w:pStyle w:val="ListBullet"/>
+      </w:pPr>
+      <w:r>
+        <w:rPr>
+          <w:b w:val="0"/>
+          <w:color w:val="4A4A49"/>
+          <w:sz w:val="22"/>
+        </w:rPr>
+        <w:t>Al entrar: Léelos en orden y subraya dos: en el 2, la IA acierta la sintaxis pero el modelo lo revisa cada uno; en el 4, lo que se guarda es el texto Mermaid (la fuente), y el PNG es solo para el informe.</w:t>
+      </w:r>
+    </w:p>
+    <w:p>
+      <w:r>
+        <w:rPr>
+          <w:b w:val="0"/>
+          <w:color w:val="4A4A49"/>
+          <w:sz w:val="22"/>
+        </w:rPr>
+        <w:t>CUIDADO: Si alguien pega el código y el visor marca error, casi siempre es un nombre con espacio o tilde, o un atributo sin tipo.</w:t>
+      </w:r>
+    </w:p>
+    <w:p>
+      <w:r>
+        <w:rPr>
+          <w:b w:val="0"/>
+          <w:color w:val="4A4A49"/>
+          <w:sz w:val="22"/>
+        </w:rPr>
+        <w:t>PASA A LA SIGUIENTE: Cerramos.</w:t>
+      </w:r>
+    </w:p>
+    <w:p>
+      <w:r>
+        <w:rPr>
+          <w:b/>
+          <w:color w:val="4A4A49"/>
+          <w:sz w:val="22"/>
+        </w:rPr>
+        <w:t>Demo que usted debe poder repetir:</w:t>
+      </w:r>
+      <w:r>
+        <w:rPr>
+          <w:b w:val="0"/>
+          <w:color w:val="4A4A49"/>
+          <w:sz w:val="22"/>
+        </w:rPr>
+        <w:t xml:space="preserve"> Boceto ER en draw.io (Dueno-Mascota-Cita) + CREATE TABLE minimo en DB Fiddle, y cierre pasando el boceto a Mermaid con IA para pegarlo renderizado en ExamLab.</w:t>
+      </w:r>
+    </w:p>
+    <w:p>
+      <w:pPr>
+        <w:spacing w:before="200" w:after="60"/>
+      </w:pPr>
+      <w:r>
+        <w:rPr>
+          <w:b/>
+          <w:color w:val="1A1C1D"/>
+          <w:sz w:val="32"/>
+        </w:rPr>
         <w:t>Referencias a diapositivas</w:t>
       </w:r>
     </w:p>
@@ -2515,7 +3058,7 @@
           <w:color w:val="4A4A49"/>
           <w:sz w:val="22"/>
         </w:rPr>
-        <w:t>Portada · Clase 1 · Revision BD I · Arranque la base de la clínica</w:t>
+        <w:t>Portada · Clase 1 · Revision BD I · Arranque de la base de datos</w:t>
       </w:r>
     </w:p>
     <w:p>
@@ -2593,7 +3136,7 @@
           <w:color w:val="4A4A49"/>
           <w:sz w:val="22"/>
         </w:rPr>
-        <w:t>ER minimo la clínica (con cardinalidad)</w:t>
+        <w:t>ER minimo de la clinica (con cardinalidad)</w:t>
       </w:r>
     </w:p>
     <w:p>
@@ -2896,7 +3439,7 @@
           <w:color w:val="4A4A49"/>
           <w:sz w:val="22"/>
         </w:rPr>
-        <w:t xml:space="preserve"> «Buenas. Hoy el hilo es VetCare DB y el tema es: Revision BD I · Arranque VetCare DB.»</w:t>
+        <w:t xml:space="preserve"> «Buenas. Hoy el hilo es VetCare DB y el tema es: Revision BD I · Arranque de la base de datos.»</w:t>
       </w:r>
     </w:p>
     <w:p>
@@ -3719,7 +4262,7 @@
           <w:color w:val="4A4A49"/>
           <w:sz w:val="22"/>
         </w:rPr>
-        <w:t xml:space="preserve"> «Queda visto: Revision BD I · Arranque VetCare DB. Si hicimos la practica, la guia y la entrega estan en la carpeta de la clase.»</w:t>
+        <w:t xml:space="preserve"> «Queda visto: Revision BD I · Arranque de la base de datos. Si hicimos la practica, la guia y la entrega estan en la carpeta de la clase.»</w:t>
       </w:r>
     </w:p>
     <w:p>

</xml_diff>